<commit_message>
fix(templates): 4.2 training themes — label rows as lines, one citation form
The label rows of the three blocks (workplace, position, trainer, periodicity, content) are
lines above the plans, the position's name first; the sessions stay a three-column table with a
repeating header. "I.P.S.S.M. Art." and "H.G. n/yyyy" throughout; II.II rows 8 and 9 read as
3.2's chapter titles.

Claude-Session: https://claude.ai/code/session_01A9qjCHVH6kcDAEKFiJoShR
</commit_message>
<xml_diff>
--- a/packages/document-engine/templates/4.2_training_themes.docx
+++ b/packages/document-engine/templates/4.2_training_themes.docx
@@ -45,402 +45,132 @@
         <w:t>TEMATICA DE INSTRUIRE PENTRU INSTRUIREA INTRODUCTIV – GENERALĂ</w:t>
       </w:r>
     </w:p>
-    <w:tbl>
-      <w:tblPr>
-        <w:tblW w:w="5000" w:type="pct"/>
+    <w:p>
+      <w:pPr>
+        <w:pStyle w:val="Normal"/>
+        <w:keepNext w:val="false"/>
+        <w:keepLines/>
+        <w:widowControl/>
+        <w:spacing w:before="240" w:after="120"/>
+        <w:ind w:left="0" w:hanging="0"/>
         <w:jc w:val="left"/>
-        <w:tblInd w:w="55" w:type="dxa"/>
-        <w:tblLayout w:type="fixed"/>
-        <w:tblCellMar>
-          <w:top w:w="55" w:type="dxa"/>
-          <w:left w:w="55" w:type="dxa"/>
-          <w:bottom w:w="55" w:type="dxa"/>
-          <w:right w:w="55" w:type="dxa"/>
-        </w:tblCellMar>
-      </w:tblPr>
-      <w:tblGrid>
-        <w:gridCol w:w="3117"/>
-        <w:gridCol w:w="6238"/>
-      </w:tblGrid>
-      <w:tr>
-        <w:trPr/>
-        <w:tc>
-          <w:tcPr>
-            <w:tcW w:w="3117" w:type="dxa"/>
-            <w:tcBorders>
-              <w:top w:val="single" w:sz="4" w:space="0" w:color="000000"/>
-              <w:left w:val="single" w:sz="4" w:space="0" w:color="000000"/>
-              <w:bottom w:val="single" w:sz="4" w:space="0" w:color="000000"/>
-            </w:tcBorders>
-            <w:vAlign w:val="center"/>
-          </w:tcPr>
-          <w:p>
-            <w:pPr>
-              <w:pStyle w:val="TableHeading"/>
-              <w:keepNext w:val="true"/>
-              <w:widowControl/>
-              <w:spacing w:before="0" w:after="0"/>
-              <w:ind w:hanging="0" w:left="0"/>
-              <w:jc w:val="left"/>
-              <w:rPr>
-                <w:rFonts w:ascii="Arial" w:hAnsi="Arial" w:eastAsia="Arial" w:cs="Arial"/>
-                <w:b/>
-                <w:i w:val="false"/>
-                <w:color w:val="auto"/>
-                <w:spacing w:val="0"/>
-                <w:w w:val="100"/>
-                <w:sz w:val="20"/>
-                <w:szCs w:val="20"/>
-                <w:lang w:val="ro-RO"/>
-              </w:rPr>
-            </w:pPr>
-            <w:r>
-              <w:rPr>
-                <w:rFonts w:eastAsia="Arial" w:cs="Arial" w:ascii="Arial" w:hAnsi="Arial"/>
-                <w:b/>
-                <w:i w:val="false"/>
-                <w:color w:val="auto"/>
-                <w:spacing w:val="0"/>
-                <w:w w:val="100"/>
-                <w:sz w:val="20"/>
-                <w:szCs w:val="20"/>
-                <w:lang w:val="ro-RO"/>
-              </w:rPr>
-              <w:t>LOCUL DE MUNCĂ:</w:t>
-            </w:r>
-          </w:p>
-        </w:tc>
-        <w:tc>
-          <w:tcPr>
-            <w:tcW w:w="6238" w:type="dxa"/>
-            <w:tcBorders>
-              <w:top w:val="single" w:sz="4" w:space="0" w:color="000000"/>
-              <w:left w:val="single" w:sz="4" w:space="0" w:color="000000"/>
-              <w:bottom w:val="single" w:sz="4" w:space="0" w:color="000000"/>
-              <w:right w:val="single" w:sz="4" w:space="0" w:color="000000"/>
-            </w:tcBorders>
-            <w:vAlign w:val="center"/>
-          </w:tcPr>
-          <w:p>
-            <w:pPr>
-              <w:pStyle w:val="TableHeading"/>
-              <w:keepNext w:val="false"/>
-              <w:widowControl/>
-              <w:spacing w:before="0" w:after="0"/>
-              <w:ind w:hanging="0" w:left="0"/>
-              <w:jc w:val="left"/>
-              <w:rPr>
-                <w:rFonts w:ascii="Arial" w:hAnsi="Arial" w:eastAsia="Arial" w:cs="Arial"/>
-                <w:b w:val="false"/>
-                <w:i w:val="false"/>
-                <w:color w:val="auto"/>
-                <w:spacing w:val="0"/>
-                <w:w w:val="100"/>
-                <w:sz w:val="20"/>
-                <w:szCs w:val="20"/>
-                <w:lang w:val="ro-RO"/>
-              </w:rPr>
-            </w:pPr>
-            <w:r>
-              <w:rPr>
-                <w:rFonts w:eastAsia="Arial" w:cs="Arial" w:ascii="Arial" w:hAnsi="Arial"/>
-                <w:b w:val="false"/>
-                <w:i w:val="false"/>
-                <w:color w:val="auto"/>
-                <w:spacing w:val="0"/>
-                <w:w w:val="100"/>
-                <w:sz w:val="20"/>
-                <w:szCs w:val="20"/>
-                <w:lang w:val="ro-RO"/>
-              </w:rPr>
-              <w:t>{{client.legalName}}</w:t>
-            </w:r>
-          </w:p>
-        </w:tc>
-      </w:tr>
-      <w:tr>
-        <w:trPr/>
-        <w:tc>
-          <w:tcPr>
-            <w:tcW w:w="3117" w:type="dxa"/>
-            <w:tcBorders>
-              <w:left w:val="single" w:sz="4" w:space="0" w:color="000000"/>
-              <w:bottom w:val="single" w:sz="4" w:space="0" w:color="000000"/>
-            </w:tcBorders>
-            <w:vAlign w:val="center"/>
-          </w:tcPr>
-          <w:p>
-            <w:pPr>
-              <w:pStyle w:val="TableContents"/>
-              <w:keepNext w:val="true"/>
-              <w:widowControl/>
-              <w:spacing w:before="0" w:after="0"/>
-              <w:ind w:hanging="0" w:left="0"/>
-              <w:jc w:val="left"/>
-              <w:rPr>
-                <w:rFonts w:ascii="Arial" w:hAnsi="Arial" w:eastAsia="Arial" w:cs="Arial"/>
-                <w:b/>
-                <w:i w:val="false"/>
-                <w:color w:val="auto"/>
-                <w:spacing w:val="0"/>
-                <w:w w:val="100"/>
-                <w:sz w:val="20"/>
-                <w:szCs w:val="20"/>
-                <w:lang w:val="ro-RO"/>
-              </w:rPr>
-            </w:pPr>
-            <w:r>
-              <w:rPr>
-                <w:rFonts w:eastAsia="Arial" w:cs="Arial" w:ascii="Arial" w:hAnsi="Arial"/>
-                <w:b/>
-                <w:i w:val="false"/>
-                <w:color w:val="auto"/>
-                <w:spacing w:val="0"/>
-                <w:w w:val="100"/>
-                <w:sz w:val="20"/>
-                <w:szCs w:val="20"/>
-                <w:lang w:val="ro-RO"/>
-              </w:rPr>
-              <w:t>FUNCȚIA:</w:t>
-            </w:r>
-          </w:p>
-        </w:tc>
-        <w:tc>
-          <w:tcPr>
-            <w:tcW w:w="6238" w:type="dxa"/>
-            <w:tcBorders>
-              <w:left w:val="single" w:sz="4" w:space="0" w:color="000000"/>
-              <w:bottom w:val="single" w:sz="4" w:space="0" w:color="000000"/>
-              <w:right w:val="single" w:sz="4" w:space="0" w:color="000000"/>
-            </w:tcBorders>
-            <w:vAlign w:val="center"/>
-          </w:tcPr>
-          <w:p>
-            <w:pPr>
-              <w:pStyle w:val="TableContents"/>
-              <w:keepNext w:val="false"/>
-              <w:widowControl/>
-              <w:spacing w:before="0" w:after="0"/>
-              <w:ind w:hanging="0" w:left="0"/>
-              <w:jc w:val="left"/>
-              <w:rPr>
-                <w:rFonts w:ascii="Arial" w:hAnsi="Arial" w:eastAsia="Arial" w:cs="Arial"/>
-                <w:b w:val="false"/>
-                <w:i w:val="false"/>
-                <w:color w:val="auto"/>
-                <w:spacing w:val="0"/>
-                <w:w w:val="100"/>
-                <w:sz w:val="20"/>
-                <w:szCs w:val="20"/>
-                <w:lang w:val="ro-RO"/>
-              </w:rPr>
-            </w:pPr>
-            <w:r>
-              <w:rPr>
-                <w:rFonts w:eastAsia="Arial" w:cs="Arial" w:ascii="Arial" w:hAnsi="Arial"/>
-                <w:b w:val="false"/>
-                <w:i w:val="false"/>
-                <w:color w:val="auto"/>
-                <w:spacing w:val="0"/>
-                <w:w w:val="100"/>
-                <w:sz w:val="20"/>
-                <w:szCs w:val="20"/>
-                <w:lang w:val="ro-RO"/>
-              </w:rPr>
-              <w:t>Întreg personalul</w:t>
-            </w:r>
-          </w:p>
-        </w:tc>
-      </w:tr>
-      <w:tr>
-        <w:trPr/>
-        <w:tc>
-          <w:tcPr>
-            <w:tcW w:w="3117" w:type="dxa"/>
-            <w:tcBorders>
-              <w:left w:val="single" w:sz="4" w:space="0" w:color="000000"/>
-              <w:bottom w:val="single" w:sz="4" w:space="0" w:color="000000"/>
-            </w:tcBorders>
-            <w:vAlign w:val="center"/>
-          </w:tcPr>
-          <w:p>
-            <w:pPr>
-              <w:pStyle w:val="TableContents"/>
-              <w:keepNext w:val="true"/>
-              <w:widowControl/>
-              <w:spacing w:before="0" w:after="0"/>
-              <w:ind w:hanging="0" w:left="0"/>
-              <w:jc w:val="left"/>
-              <w:rPr>
-                <w:rFonts w:ascii="Arial" w:hAnsi="Arial" w:eastAsia="Arial" w:cs="Arial"/>
-                <w:b/>
-                <w:i w:val="false"/>
-                <w:color w:val="auto"/>
-                <w:spacing w:val="0"/>
-                <w:w w:val="100"/>
-                <w:sz w:val="20"/>
-                <w:szCs w:val="20"/>
-                <w:lang w:val="ro-RO"/>
-              </w:rPr>
-            </w:pPr>
-            <w:r>
-              <w:rPr>
-                <w:rFonts w:eastAsia="Arial" w:cs="Arial" w:ascii="Arial" w:hAnsi="Arial"/>
-                <w:b/>
-                <w:i w:val="false"/>
-                <w:color w:val="auto"/>
-                <w:spacing w:val="0"/>
-                <w:w w:val="100"/>
-                <w:sz w:val="20"/>
-                <w:szCs w:val="20"/>
-                <w:lang w:val="ro-RO"/>
-              </w:rPr>
-              <w:t>CINE EFECTUEAZĂ INSTRUIREA:</w:t>
-            </w:r>
-          </w:p>
-        </w:tc>
-        <w:tc>
-          <w:tcPr>
-            <w:tcW w:w="6238" w:type="dxa"/>
-            <w:tcBorders>
-              <w:left w:val="single" w:sz="4" w:space="0" w:color="000000"/>
-              <w:bottom w:val="single" w:sz="4" w:space="0" w:color="000000"/>
-              <w:right w:val="single" w:sz="4" w:space="0" w:color="000000"/>
-            </w:tcBorders>
-            <w:vAlign w:val="center"/>
-          </w:tcPr>
-          <w:p>
-            <w:pPr>
-              <w:pStyle w:val="TableContents"/>
-              <w:keepNext w:val="false"/>
-              <w:widowControl/>
-              <w:spacing w:before="0" w:after="0"/>
-              <w:ind w:hanging="0" w:left="0"/>
-              <w:jc w:val="left"/>
-              <w:rPr>
-                <w:rFonts w:ascii="Arial" w:hAnsi="Arial" w:eastAsia="Arial" w:cs="Arial"/>
-                <w:b w:val="false"/>
-                <w:i w:val="false"/>
-                <w:color w:val="auto"/>
-                <w:spacing w:val="0"/>
-                <w:w w:val="100"/>
-                <w:sz w:val="20"/>
-                <w:szCs w:val="20"/>
-                <w:lang w:val="ro-RO"/>
-              </w:rPr>
-            </w:pPr>
-            <w:r>
-              <w:rPr>
-                <w:rFonts w:eastAsia="Arial" w:cs="Arial" w:ascii="Arial" w:hAnsi="Arial"/>
-                <w:b w:val="false"/>
-                <w:i w:val="false"/>
-                <w:color w:val="auto"/>
-                <w:spacing w:val="0"/>
-                <w:w w:val="100"/>
-                <w:sz w:val="20"/>
-                <w:szCs w:val="20"/>
-                <w:lang w:val="ro-RO"/>
-              </w:rPr>
-              <w:t>{{provider.legalName}} – {{specialist.name}}</w:t>
-            </w:r>
-          </w:p>
-        </w:tc>
-      </w:tr>
-      <w:tr>
-        <w:trPr/>
-        <w:tc>
-          <w:tcPr>
-            <w:tcW w:w="3117" w:type="dxa"/>
-            <w:tcBorders>
-              <w:left w:val="single" w:sz="4" w:space="0" w:color="000000"/>
-              <w:bottom w:val="single" w:sz="4" w:space="0" w:color="000000"/>
-            </w:tcBorders>
-            <w:vAlign w:val="center"/>
-          </w:tcPr>
-          <w:p>
-            <w:pPr>
-              <w:pStyle w:val="TableContents"/>
-              <w:keepNext w:val="false"/>
-              <w:widowControl/>
-              <w:spacing w:before="0" w:after="0"/>
-              <w:ind w:hanging="0" w:left="0"/>
-              <w:jc w:val="left"/>
-              <w:rPr>
-                <w:rFonts w:ascii="Arial" w:hAnsi="Arial" w:eastAsia="Arial" w:cs="Arial"/>
-                <w:b/>
-                <w:i w:val="false"/>
-                <w:color w:val="auto"/>
-                <w:spacing w:val="0"/>
-                <w:w w:val="100"/>
-                <w:sz w:val="20"/>
-                <w:szCs w:val="20"/>
-                <w:lang w:val="ro-RO"/>
-              </w:rPr>
-            </w:pPr>
-            <w:r>
-              <w:rPr>
-                <w:rFonts w:eastAsia="Arial" w:cs="Arial" w:ascii="Arial" w:hAnsi="Arial"/>
-                <w:b/>
-                <w:i w:val="false"/>
-                <w:color w:val="auto"/>
-                <w:spacing w:val="0"/>
-                <w:w w:val="100"/>
-                <w:sz w:val="20"/>
-                <w:szCs w:val="20"/>
-                <w:lang w:val="ro-RO"/>
-              </w:rPr>
-              <w:t>CONȚINUTUL MATERIALULUI DE INSTRUIRE:</w:t>
-            </w:r>
-          </w:p>
-        </w:tc>
-        <w:tc>
-          <w:tcPr>
-            <w:tcW w:w="6238" w:type="dxa"/>
-            <w:tcBorders>
-              <w:left w:val="single" w:sz="4" w:space="0" w:color="000000"/>
-              <w:bottom w:val="single" w:sz="4" w:space="0" w:color="000000"/>
-              <w:right w:val="single" w:sz="4" w:space="0" w:color="000000"/>
-            </w:tcBorders>
-            <w:vAlign w:val="center"/>
-          </w:tcPr>
-          <w:p>
-            <w:pPr>
-              <w:pStyle w:val="TableContents"/>
-              <w:keepNext w:val="false"/>
-              <w:widowControl/>
-              <w:spacing w:before="0" w:after="0"/>
-              <w:ind w:hanging="0" w:left="0"/>
-              <w:jc w:val="left"/>
-              <w:rPr>
-                <w:rFonts w:ascii="Arial" w:hAnsi="Arial" w:eastAsia="Arial" w:cs="Arial"/>
-                <w:b w:val="false"/>
-                <w:i w:val="false"/>
-                <w:color w:val="auto"/>
-                <w:spacing w:val="0"/>
-                <w:w w:val="100"/>
-                <w:sz w:val="20"/>
-                <w:szCs w:val="20"/>
-                <w:lang w:val="ro-RO"/>
-              </w:rPr>
-            </w:pPr>
-            <w:r>
-              <w:rPr>
-                <w:rFonts w:eastAsia="Arial" w:cs="Arial" w:ascii="Arial" w:hAnsi="Arial"/>
-                <w:b w:val="false"/>
-                <w:i w:val="false"/>
-                <w:color w:val="auto"/>
-                <w:spacing w:val="0"/>
-                <w:w w:val="100"/>
-                <w:sz w:val="20"/>
-                <w:szCs w:val="20"/>
-                <w:lang w:val="ro-RO"/>
-              </w:rPr>
-              <w:t>Conform MISSMIG Art. 1 – 327; Legislația de securitate și sănătate în muncă; Consecințele posibile ale necunoașterii și nerespectării legislației de securitate și sănătate în muncă; Măsuri de acordare a primului ajutor, de prevenire și stingere a incendiilor și evacuarea lucrătorilor; Riscurile de accidentare și îmbolnăvire profesională specifice unității.</w:t>
-            </w:r>
-          </w:p>
-        </w:tc>
-      </w:tr>
-    </w:tbl>
+        <w:rPr>
+          <w:rFonts w:ascii="Arial" w:hAnsi="Arial" w:cs="Arial"/>
+          <w:sz w:val="20"/>
+          <w:szCs w:val="20"/>
+          <w:lang w:val="ro-RO"/>
+        </w:rPr>
+      </w:pPr>
+      <w:r>
+        <w:rPr>
+          <w:rFonts w:eastAsia="Arial" w:cs="Arial" w:ascii="Arial" w:hAnsi="Arial"/>
+          <w:b/>
+          <w:color w:val="auto"/>
+          <w:sz w:val="20"/>
+          <w:szCs w:val="20"/>
+          <w:lang w:val="ro-RO"/>
+        </w:rPr>
+        <w:t xml:space="preserve">LOCUL DE MUNCĂ: </w:t>
+      </w:r>
+      <w:r>
+        <w:rPr>
+          <w:rFonts w:eastAsia="Arial" w:cs="Arial" w:ascii="Arial" w:hAnsi="Arial"/>
+          <w:b w:val="false"/>
+          <w:i w:val="false"/>
+          <w:color w:val="auto"/>
+          <w:spacing w:val="0"/>
+          <w:w w:val="100"/>
+          <w:sz w:val="20"/>
+          <w:szCs w:val="20"/>
+          <w:lang w:val="ro-RO"/>
+        </w:rPr>
+        <w:t>{{client.legalName}}</w:t>
+      </w:r>
+      <w:r>
+        <w:br/>
+      </w:r>
+      <w:r>
+        <w:rPr>
+          <w:rFonts w:eastAsia="Arial" w:cs="Arial" w:ascii="Arial" w:hAnsi="Arial"/>
+          <w:b/>
+          <w:color w:val="auto"/>
+          <w:sz w:val="20"/>
+          <w:szCs w:val="20"/>
+          <w:lang w:val="ro-RO"/>
+        </w:rPr>
+        <w:t xml:space="preserve">FUNCȚIA: </w:t>
+      </w:r>
+      <w:r>
+        <w:rPr>
+          <w:rFonts w:eastAsia="Arial" w:cs="Arial" w:ascii="Arial" w:hAnsi="Arial"/>
+          <w:b w:val="false"/>
+          <w:i w:val="false"/>
+          <w:color w:val="auto"/>
+          <w:spacing w:val="0"/>
+          <w:w w:val="100"/>
+          <w:sz w:val="20"/>
+          <w:szCs w:val="20"/>
+          <w:lang w:val="ro-RO"/>
+        </w:rPr>
+        <w:t>Întreg personalul</w:t>
+      </w:r>
+      <w:r>
+        <w:br/>
+      </w:r>
+      <w:r>
+        <w:rPr>
+          <w:rFonts w:eastAsia="Arial" w:cs="Arial" w:ascii="Arial" w:hAnsi="Arial"/>
+          <w:b/>
+          <w:color w:val="auto"/>
+          <w:sz w:val="20"/>
+          <w:szCs w:val="20"/>
+          <w:lang w:val="ro-RO"/>
+        </w:rPr>
+        <w:t xml:space="preserve">CINE EFECTUEAZĂ INSTRUIREA: </w:t>
+      </w:r>
+      <w:r>
+        <w:rPr>
+          <w:rFonts w:eastAsia="Arial" w:cs="Arial" w:ascii="Arial" w:hAnsi="Arial"/>
+          <w:b w:val="false"/>
+          <w:i w:val="false"/>
+          <w:color w:val="auto"/>
+          <w:spacing w:val="0"/>
+          <w:w w:val="100"/>
+          <w:sz w:val="20"/>
+          <w:szCs w:val="20"/>
+          <w:lang w:val="ro-RO"/>
+        </w:rPr>
+        <w:t>{{provider.legalName}} – {{specialist.name}}</w:t>
+      </w:r>
+      <w:r>
+        <w:br/>
+      </w:r>
+      <w:r>
+        <w:rPr>
+          <w:rFonts w:eastAsia="Arial" w:cs="Arial" w:ascii="Arial" w:hAnsi="Arial"/>
+          <w:b/>
+          <w:color w:val="auto"/>
+          <w:sz w:val="20"/>
+          <w:szCs w:val="20"/>
+          <w:lang w:val="ro-RO"/>
+        </w:rPr>
+        <w:t xml:space="preserve">CONȚINUTUL MATERIALULUI DE INSTRUIRE: </w:t>
+      </w:r>
+      <w:r>
+        <w:rPr>
+          <w:rFonts w:eastAsia="Arial" w:cs="Arial" w:ascii="Arial" w:hAnsi="Arial"/>
+          <w:b w:val="false"/>
+          <w:i w:val="false"/>
+          <w:color w:val="auto"/>
+          <w:spacing w:val="0"/>
+          <w:w w:val="100"/>
+          <w:sz w:val="20"/>
+          <w:szCs w:val="20"/>
+          <w:lang w:val="ro-RO"/>
+        </w:rPr>
+        <w:t>Conform MISSMIG Art. 1 – 327; Legislația de securitate și sănătate în muncă; Consecințele posibile ale necunoașterii și nerespectării legislației de securitate și sănătate în muncă; Măsuri de acordare a primului ajutor, de prevenire și stingere a incendiilor și evacuarea lucrătorilor; Riscurile de accidentare și îmbolnăvire profesională specifice unității.</w:t>
+      </w:r>
+    </w:p>
     <w:p>
       <w:pPr>
         <w:pStyle w:val="Normal"/>
@@ -4600,20 +4330,16 @@
     <w:p>
       <w:pPr>
         <w:pStyle w:val="Normal"/>
-        <w:keepNext w:val="true"/>
+        <w:keepNext w:val="false"/>
+        <w:keepLines/>
         <w:widowControl/>
-        <w:tabs>
-          <w:tab w:val="clear" w:pos="720"/>
-          <w:tab w:val="left" w:pos="276" w:leader="none"/>
-        </w:tabs>
         <w:spacing w:before="240" w:after="120"/>
-        <w:ind w:hanging="0"/>
+        <w:ind w:left="0" w:hanging="0"/>
         <w:jc w:val="left"/>
         <w:rPr>
           <w:rFonts w:ascii="Arial" w:hAnsi="Arial" w:cs="Arial"/>
-          <w:b/>
-          <w:sz w:val="18"/>
-          <w:szCs w:val="18"/>
+          <w:sz w:val="20"/>
+          <w:szCs w:val="20"/>
           <w:lang w:val="ro-RO"/>
         </w:rPr>
       </w:pPr>
@@ -4621,6 +4347,60 @@
         <w:rPr>
           <w:rFonts w:eastAsia="Arial" w:cs="Arial" w:ascii="Arial" w:hAnsi="Arial"/>
           <w:b/>
+          <w:color w:val="auto"/>
+          <w:sz w:val="20"/>
+          <w:szCs w:val="20"/>
+          <w:lang w:val="ro-RO"/>
+        </w:rPr>
+        <w:t xml:space="preserve">{{name}}</w:t>
+      </w:r>
+      <w:r>
+        <w:br/>
+      </w:r>
+      <w:r>
+        <w:rPr>
+          <w:rFonts w:eastAsia="Arial" w:cs="Arial" w:ascii="Arial" w:hAnsi="Arial"/>
+          <w:b/>
+          <w:color w:val="auto"/>
+          <w:sz w:val="20"/>
+          <w:szCs w:val="20"/>
+          <w:lang w:val="ro-RO"/>
+        </w:rPr>
+        <w:t xml:space="preserve">LOCUL DE MUNCĂ: </w:t>
+      </w:r>
+      <w:r>
+        <w:rPr>
+          <w:rFonts w:eastAsia="Arial" w:cs="Arial" w:ascii="Arial" w:hAnsi="Arial"/>
+          <w:b w:val="false"/>
+          <w:i w:val="false"/>
+          <w:color w:val="auto"/>
+          <w:spacing w:val="0"/>
+          <w:w w:val="100"/>
+          <w:sz w:val="20"/>
+          <w:szCs w:val="20"/>
+          <w:lang w:val="ro-RO"/>
+        </w:rPr>
+        <w:t>{{client.legalName}}</w:t>
+      </w:r>
+      <w:r>
+        <w:br/>
+      </w:r>
+      <w:r>
+        <w:rPr>
+          <w:rFonts w:eastAsia="Arial" w:cs="Arial" w:ascii="Arial" w:hAnsi="Arial"/>
+          <w:b/>
+          <w:color w:val="auto"/>
+          <w:sz w:val="20"/>
+          <w:szCs w:val="20"/>
+          <w:lang w:val="ro-RO"/>
+        </w:rPr>
+        <w:t xml:space="preserve">FUNCȚIA: </w:t>
+      </w:r>
+      <w:r>
+        <w:rPr>
+          <w:rFonts w:eastAsia="Arial" w:cs="Arial" w:ascii="Arial" w:hAnsi="Arial"/>
+          <w:b w:val="false"/>
+          <w:i w:val="false"/>
           <w:color w:val="auto"/>
           <w:spacing w:val="0"/>
           <w:w w:val="100"/>
@@ -4630,411 +4410,63 @@
         </w:rPr>
         <w:t>{{name}}</w:t>
       </w:r>
+      <w:r>
+        <w:br/>
+      </w:r>
+      <w:r>
+        <w:rPr>
+          <w:rFonts w:eastAsia="Arial" w:cs="Arial" w:ascii="Arial" w:hAnsi="Arial"/>
+          <w:b/>
+          <w:color w:val="auto"/>
+          <w:sz w:val="20"/>
+          <w:szCs w:val="20"/>
+          <w:lang w:val="ro-RO"/>
+        </w:rPr>
+        <w:t xml:space="preserve">CINE EFECTUEAZĂ INSTRUIREA – ȘEF DIRECT DE LOC DE MUNCĂ: </w:t>
+      </w:r>
+      <w:r>
+        <w:rPr>
+          <w:rFonts w:eastAsia="Arial" w:cs="Arial" w:ascii="Arial" w:hAnsi="Arial"/>
+          <w:b w:val="false"/>
+          <w:i w:val="false"/>
+          <w:color w:val="auto"/>
+          <w:spacing w:val="0"/>
+          <w:w w:val="100"/>
+          <w:sz w:val="20"/>
+          <w:szCs w:val="20"/>
+          <w:lang w:val="ro-RO"/>
+        </w:rPr>
+        <w:t>{{trainer}}</w:t>
+      </w:r>
+      <w:r>
+        <w:br/>
+      </w:r>
+      <w:r>
+        <w:rPr>
+          <w:rFonts w:eastAsia="Arial" w:cs="Arial" w:ascii="Arial" w:hAnsi="Arial"/>
+          <w:b/>
+          <w:color w:val="auto"/>
+          <w:sz w:val="20"/>
+          <w:szCs w:val="20"/>
+          <w:lang w:val="ro-RO"/>
+        </w:rPr>
+        <w:t xml:space="preserve">CONȚINUTUL MATERIALULUI DE INSTRUIRE: </w:t>
+      </w:r>
+      <w:r>
+        <w:rPr>
+          <w:rFonts w:eastAsia="Arial" w:cs="Arial" w:ascii="Arial" w:hAnsi="Arial"/>
+          <w:b w:val="false"/>
+          <w:i w:val="false"/>
+          <w:color w:val="auto"/>
+          <w:spacing w:val="0"/>
+          <w:w w:val="100"/>
+          <w:sz w:val="20"/>
+          <w:szCs w:val="20"/>
+          <w:lang w:val="ro-RO"/>
+        </w:rPr>
+        <w:t xml:space="preserve">H.G. 1051/2006, H.G. 1146/2006, H.G. 493/2006; H.G. 259/2022; I.P.S.S.M. Art. 1 – 294; {{#modules}}{{citation}}; {{/modules}}Demonstrații practice privind activitățile desfășurate, echipamentele de muncă utilizate, utilizarea echipamentului individual de protecție, a mijloacelor de alarmare, intervenție, evacuare și de prim ajutor.</w:t>
+      </w:r>
     </w:p>
-    <w:tbl>
-      <w:tblPr>
-        <w:tblW w:w="5000" w:type="pct"/>
-        <w:jc w:val="left"/>
-        <w:tblInd w:w="55" w:type="dxa"/>
-        <w:tblLayout w:type="fixed"/>
-        <w:tblCellMar>
-          <w:top w:w="55" w:type="dxa"/>
-          <w:left w:w="55" w:type="dxa"/>
-          <w:bottom w:w="55" w:type="dxa"/>
-          <w:right w:w="55" w:type="dxa"/>
-        </w:tblCellMar>
-      </w:tblPr>
-      <w:tblGrid>
-        <w:gridCol w:w="3117"/>
-        <w:gridCol w:w="6238"/>
-      </w:tblGrid>
-      <w:tr>
-        <w:trPr>
-          <w:cantSplit/>
-        </w:trPr>
-        <w:tc>
-          <w:tcPr>
-            <w:tcW w:w="3117" w:type="dxa"/>
-            <w:tcBorders>
-              <w:top w:val="single" w:sz="4" w:space="0" w:color="000000"/>
-              <w:left w:val="single" w:sz="4" w:space="0" w:color="000000"/>
-              <w:bottom w:val="single" w:sz="4" w:space="0" w:color="000000"/>
-            </w:tcBorders>
-            <w:vAlign w:val="center"/>
-          </w:tcPr>
-          <w:p>
-            <w:pPr>
-              <w:pStyle w:val="TableHeading"/>
-              <w:keepNext w:val="true"/>
-              <w:widowControl/>
-              <w:spacing w:before="0" w:after="0"/>
-              <w:ind w:hanging="0" w:left="0"/>
-              <w:jc w:val="left"/>
-              <w:rPr>
-                <w:rFonts w:ascii="Arial" w:hAnsi="Arial" w:eastAsia="Arial" w:cs="Arial"/>
-                <w:b/>
-                <w:i w:val="false"/>
-                <w:color w:val="auto"/>
-                <w:spacing w:val="0"/>
-                <w:w w:val="100"/>
-                <w:sz w:val="20"/>
-                <w:szCs w:val="20"/>
-                <w:lang w:val="ro-RO"/>
-              </w:rPr>
-            </w:pPr>
-            <w:r>
-              <w:rPr>
-                <w:rFonts w:eastAsia="Arial" w:cs="Arial" w:ascii="Arial" w:hAnsi="Arial"/>
-                <w:b/>
-                <w:i w:val="false"/>
-                <w:color w:val="auto"/>
-                <w:spacing w:val="0"/>
-                <w:w w:val="100"/>
-                <w:sz w:val="20"/>
-                <w:szCs w:val="20"/>
-                <w:lang w:val="ro-RO"/>
-              </w:rPr>
-              <w:t>LOCUL DE MUNCĂ:</w:t>
-            </w:r>
-          </w:p>
-        </w:tc>
-        <w:tc>
-          <w:tcPr>
-            <w:tcW w:w="6238" w:type="dxa"/>
-            <w:tcBorders>
-              <w:top w:val="single" w:sz="4" w:space="0" w:color="000000"/>
-              <w:left w:val="single" w:sz="4" w:space="0" w:color="000000"/>
-              <w:bottom w:val="single" w:sz="4" w:space="0" w:color="000000"/>
-              <w:right w:val="single" w:sz="4" w:space="0" w:color="000000"/>
-            </w:tcBorders>
-            <w:vAlign w:val="center"/>
-          </w:tcPr>
-          <w:p>
-            <w:pPr>
-              <w:pStyle w:val="TableHeading"/>
-              <w:keepNext w:val="false"/>
-              <w:widowControl/>
-              <w:spacing w:before="0" w:after="0"/>
-              <w:ind w:hanging="0" w:left="0"/>
-              <w:jc w:val="left"/>
-              <w:rPr>
-                <w:rFonts w:ascii="Arial" w:hAnsi="Arial" w:eastAsia="Arial" w:cs="Arial"/>
-                <w:b w:val="false"/>
-                <w:i w:val="false"/>
-                <w:color w:val="auto"/>
-                <w:spacing w:val="0"/>
-                <w:w w:val="100"/>
-                <w:sz w:val="20"/>
-                <w:szCs w:val="20"/>
-                <w:lang w:val="ro-RO"/>
-              </w:rPr>
-            </w:pPr>
-            <w:r>
-              <w:rPr>
-                <w:rFonts w:eastAsia="Arial" w:cs="Arial" w:ascii="Arial" w:hAnsi="Arial"/>
-                <w:b w:val="false"/>
-                <w:i w:val="false"/>
-                <w:color w:val="auto"/>
-                <w:spacing w:val="0"/>
-                <w:w w:val="100"/>
-                <w:sz w:val="20"/>
-                <w:szCs w:val="20"/>
-                <w:lang w:val="ro-RO"/>
-              </w:rPr>
-              <w:t>{{client.legalName}}</w:t>
-            </w:r>
-          </w:p>
-        </w:tc>
-      </w:tr>
-      <w:tr>
-        <w:trPr>
-          <w:cantSplit/>
-        </w:trPr>
-        <w:tc>
-          <w:tcPr>
-            <w:tcW w:w="3117" w:type="dxa"/>
-            <w:tcBorders>
-              <w:left w:val="single" w:sz="4" w:space="0" w:color="000000"/>
-              <w:bottom w:val="single" w:sz="4" w:space="0" w:color="000000"/>
-            </w:tcBorders>
-            <w:vAlign w:val="center"/>
-          </w:tcPr>
-          <w:p>
-            <w:pPr>
-              <w:pStyle w:val="TableContents"/>
-              <w:keepNext w:val="true"/>
-              <w:widowControl/>
-              <w:spacing w:before="0" w:after="0"/>
-              <w:ind w:hanging="0" w:left="0"/>
-              <w:jc w:val="left"/>
-              <w:rPr>
-                <w:rFonts w:ascii="Arial" w:hAnsi="Arial" w:eastAsia="Arial" w:cs="Arial"/>
-                <w:b/>
-                <w:i w:val="false"/>
-                <w:color w:val="auto"/>
-                <w:spacing w:val="0"/>
-                <w:w w:val="100"/>
-                <w:sz w:val="20"/>
-                <w:szCs w:val="20"/>
-                <w:lang w:val="ro-RO"/>
-              </w:rPr>
-            </w:pPr>
-            <w:r>
-              <w:rPr>
-                <w:rFonts w:eastAsia="Arial" w:cs="Arial" w:ascii="Arial" w:hAnsi="Arial"/>
-                <w:b/>
-                <w:i w:val="false"/>
-                <w:color w:val="auto"/>
-                <w:spacing w:val="0"/>
-                <w:w w:val="100"/>
-                <w:sz w:val="20"/>
-                <w:szCs w:val="20"/>
-                <w:lang w:val="ro-RO"/>
-              </w:rPr>
-              <w:t>FUNCȚIA:</w:t>
-            </w:r>
-          </w:p>
-        </w:tc>
-        <w:tc>
-          <w:tcPr>
-            <w:tcW w:w="6238" w:type="dxa"/>
-            <w:tcBorders>
-              <w:left w:val="single" w:sz="4" w:space="0" w:color="000000"/>
-              <w:bottom w:val="single" w:sz="4" w:space="0" w:color="000000"/>
-              <w:right w:val="single" w:sz="4" w:space="0" w:color="000000"/>
-            </w:tcBorders>
-            <w:vAlign w:val="center"/>
-          </w:tcPr>
-          <w:p>
-            <w:pPr>
-              <w:pStyle w:val="TableContents"/>
-              <w:keepNext w:val="false"/>
-              <w:widowControl/>
-              <w:spacing w:before="0" w:after="0"/>
-              <w:ind w:hanging="0" w:left="0"/>
-              <w:jc w:val="left"/>
-              <w:rPr>
-                <w:rFonts w:ascii="Arial" w:hAnsi="Arial" w:eastAsia="Arial" w:cs="Arial"/>
-                <w:b w:val="false"/>
-                <w:i w:val="false"/>
-                <w:color w:val="auto"/>
-                <w:spacing w:val="0"/>
-                <w:w w:val="100"/>
-                <w:sz w:val="20"/>
-                <w:szCs w:val="20"/>
-                <w:lang w:val="ro-RO"/>
-              </w:rPr>
-            </w:pPr>
-            <w:r>
-              <w:rPr>
-                <w:rFonts w:eastAsia="Arial" w:cs="Arial" w:ascii="Arial" w:hAnsi="Arial"/>
-                <w:b w:val="false"/>
-                <w:i w:val="false"/>
-                <w:color w:val="auto"/>
-                <w:spacing w:val="0"/>
-                <w:w w:val="100"/>
-                <w:sz w:val="20"/>
-                <w:szCs w:val="20"/>
-                <w:lang w:val="ro-RO"/>
-              </w:rPr>
-              <w:t>{{name}}</w:t>
-            </w:r>
-          </w:p>
-        </w:tc>
-      </w:tr>
-      <w:tr>
-        <w:trPr>
-          <w:cantSplit/>
-        </w:trPr>
-        <w:tc>
-          <w:tcPr>
-            <w:tcW w:w="3117" w:type="dxa"/>
-            <w:tcBorders>
-              <w:left w:val="single" w:sz="4" w:space="0" w:color="000000"/>
-              <w:bottom w:val="single" w:sz="4" w:space="0" w:color="000000"/>
-            </w:tcBorders>
-            <w:vAlign w:val="center"/>
-          </w:tcPr>
-          <w:p>
-            <w:pPr>
-              <w:pStyle w:val="TableContents"/>
-              <w:keepNext w:val="true"/>
-              <w:widowControl/>
-              <w:spacing w:before="0" w:after="0"/>
-              <w:ind w:hanging="0" w:left="0"/>
-              <w:jc w:val="left"/>
-              <w:rPr>
-                <w:rFonts w:ascii="Arial" w:hAnsi="Arial" w:eastAsia="Arial" w:cs="Arial"/>
-                <w:b/>
-                <w:i w:val="false"/>
-                <w:color w:val="auto"/>
-                <w:spacing w:val="0"/>
-                <w:w w:val="100"/>
-                <w:sz w:val="20"/>
-                <w:szCs w:val="20"/>
-                <w:lang w:val="ro-RO"/>
-              </w:rPr>
-            </w:pPr>
-            <w:r>
-              <w:rPr>
-                <w:rFonts w:eastAsia="Arial" w:cs="Arial" w:ascii="Arial" w:hAnsi="Arial"/>
-                <w:b/>
-                <w:i w:val="false"/>
-                <w:color w:val="auto"/>
-                <w:spacing w:val="0"/>
-                <w:w w:val="100"/>
-                <w:sz w:val="20"/>
-                <w:szCs w:val="20"/>
-                <w:lang w:val="ro-RO"/>
-              </w:rPr>
-              <w:t>CINE EFECTUEAZĂ INSTRUIREA – ȘEF DIRECT DE LOC DE MUNCĂ:</w:t>
-            </w:r>
-          </w:p>
-        </w:tc>
-        <w:tc>
-          <w:tcPr>
-            <w:tcW w:w="6238" w:type="dxa"/>
-            <w:tcBorders>
-              <w:left w:val="single" w:sz="4" w:space="0" w:color="000000"/>
-              <w:bottom w:val="single" w:sz="4" w:space="0" w:color="000000"/>
-              <w:right w:val="single" w:sz="4" w:space="0" w:color="000000"/>
-            </w:tcBorders>
-            <w:vAlign w:val="center"/>
-          </w:tcPr>
-          <w:p>
-            <w:pPr>
-              <w:pStyle w:val="TableContents"/>
-              <w:keepNext w:val="false"/>
-              <w:widowControl/>
-              <w:spacing w:before="0" w:after="0"/>
-              <w:ind w:hanging="0" w:left="0"/>
-              <w:jc w:val="left"/>
-              <w:rPr>
-                <w:rFonts w:ascii="Arial" w:hAnsi="Arial" w:eastAsia="Arial" w:cs="Arial"/>
-                <w:b w:val="false"/>
-                <w:i w:val="false"/>
-                <w:color w:val="auto"/>
-                <w:spacing w:val="0"/>
-                <w:w w:val="100"/>
-                <w:sz w:val="20"/>
-                <w:szCs w:val="20"/>
-                <w:lang w:val="ro-RO"/>
-              </w:rPr>
-            </w:pPr>
-            <w:r>
-              <w:rPr>
-                <w:rFonts w:eastAsia="Arial" w:cs="Arial" w:ascii="Arial" w:hAnsi="Arial"/>
-                <w:b w:val="false"/>
-                <w:i w:val="false"/>
-                <w:color w:val="auto"/>
-                <w:spacing w:val="0"/>
-                <w:w w:val="100"/>
-                <w:sz w:val="20"/>
-                <w:szCs w:val="20"/>
-                <w:lang w:val="ro-RO"/>
-              </w:rPr>
-              <w:t>{{trainer}}</w:t>
-            </w:r>
-          </w:p>
-        </w:tc>
-      </w:tr>
-      <w:tr>
-        <w:trPr>
-          <w:cantSplit/>
-        </w:trPr>
-        <w:tc>
-          <w:tcPr>
-            <w:tcW w:w="3117" w:type="dxa"/>
-            <w:tcBorders>
-              <w:left w:val="single" w:sz="4" w:space="0" w:color="000000"/>
-              <w:bottom w:val="single" w:sz="4" w:space="0" w:color="000000"/>
-            </w:tcBorders>
-            <w:vAlign w:val="center"/>
-          </w:tcPr>
-          <w:p>
-            <w:pPr>
-              <w:pStyle w:val="TableContents"/>
-              <w:keepNext w:val="false"/>
-              <w:widowControl/>
-              <w:spacing w:before="0" w:after="0"/>
-              <w:ind w:hanging="0" w:left="0"/>
-              <w:jc w:val="left"/>
-              <w:rPr>
-                <w:rFonts w:ascii="Arial" w:hAnsi="Arial" w:eastAsia="Arial" w:cs="Arial"/>
-                <w:b/>
-                <w:i w:val="false"/>
-                <w:color w:val="auto"/>
-                <w:spacing w:val="0"/>
-                <w:w w:val="100"/>
-                <w:sz w:val="20"/>
-                <w:szCs w:val="20"/>
-                <w:lang w:val="ro-RO"/>
-              </w:rPr>
-            </w:pPr>
-            <w:r>
-              <w:rPr>
-                <w:rFonts w:eastAsia="Arial" w:cs="Arial" w:ascii="Arial" w:hAnsi="Arial"/>
-                <w:b/>
-                <w:i w:val="false"/>
-                <w:color w:val="auto"/>
-                <w:spacing w:val="0"/>
-                <w:w w:val="100"/>
-                <w:sz w:val="20"/>
-                <w:szCs w:val="20"/>
-                <w:lang w:val="ro-RO"/>
-              </w:rPr>
-              <w:t>CONȚINUTUL MATERIALULUI DE INSTRUIRE:</w:t>
-            </w:r>
-          </w:p>
-        </w:tc>
-        <w:tc>
-          <w:tcPr>
-            <w:tcW w:w="6238" w:type="dxa"/>
-            <w:tcBorders>
-              <w:left w:val="single" w:sz="4" w:space="0" w:color="000000"/>
-              <w:bottom w:val="single" w:sz="4" w:space="0" w:color="000000"/>
-              <w:right w:val="single" w:sz="4" w:space="0" w:color="000000"/>
-            </w:tcBorders>
-            <w:vAlign w:val="center"/>
-          </w:tcPr>
-          <w:p>
-            <w:pPr>
-              <w:pStyle w:val="TableContents"/>
-              <w:keepNext w:val="false"/>
-              <w:widowControl/>
-              <w:spacing w:before="0" w:after="0"/>
-              <w:ind w:hanging="0" w:left="0"/>
-              <w:jc w:val="left"/>
-              <w:rPr>
-                <w:rFonts w:ascii="Arial" w:hAnsi="Arial" w:eastAsia="Arial" w:cs="Arial"/>
-                <w:b w:val="false"/>
-                <w:i w:val="false"/>
-                <w:color w:val="auto"/>
-                <w:spacing w:val="0"/>
-                <w:w w:val="100"/>
-                <w:sz w:val="20"/>
-                <w:szCs w:val="20"/>
-                <w:lang w:val="ro-RO"/>
-              </w:rPr>
-            </w:pPr>
-            <w:r>
-              <w:rPr>
-                <w:rFonts w:eastAsia="Arial" w:cs="Arial" w:ascii="Arial" w:hAnsi="Arial"/>
-                <w:b w:val="false"/>
-                <w:i w:val="false"/>
-                <w:color w:val="auto"/>
-                <w:spacing w:val="0"/>
-                <w:w w:val="100"/>
-                <w:sz w:val="20"/>
-                <w:szCs w:val="20"/>
-                <w:lang w:val="ro-RO"/>
-              </w:rPr>
-              <w:t>HG 1051/2006, HG 1146/2006, HG 493/2006; HG 259/2022; IPSSM Art. 1 – 294; {{#modules}}{{citation}}; {{/modules}}Demonstrații practice privind activitățile desfășurate, echipamentele de muncă utilizate, utilizarea echipamentului individual de protecție, a mijloacelor de alarmare, intervenție, evacuare și de prim ajutor.</w:t>
-            </w:r>
-          </w:p>
-        </w:tc>
-      </w:tr>
-    </w:tbl>
     <w:p>
       <w:pPr>
         <w:pStyle w:val="Normal"/>
@@ -5508,7 +4940,7 @@
                 <w:szCs w:val="20"/>
                 <w:lang w:val="ro-RO"/>
               </w:rPr>
-              <w:t>H.G. 1051/ 2006, H.G. 1028/ 2006, H.G. 1146/ 2006, H.G. 493/ 2006, HG 259/2022</w:t>
+              <w:t xml:space="preserve">H.G. 1051/2006, H.G. 1028/2006, H.G. 1146/2006, H.G. 493/2006, H.G. 259/2022</w:t>
             </w:r>
           </w:p>
         </w:tc>
@@ -5791,7 +5223,7 @@
                 <w:szCs w:val="20"/>
                 <w:lang w:val="ro-RO"/>
               </w:rPr>
-              <w:t>IPSSM Art. 1 – 9</w:t>
+              <w:t xml:space="preserve">I.P.S.S.M. Art. 1 – 9</w:t>
             </w:r>
           </w:p>
         </w:tc>
@@ -5977,7 +5409,7 @@
                 <w:szCs w:val="20"/>
                 <w:lang w:val="ro-RO"/>
               </w:rPr>
-              <w:t>IPSSM Art. 10 – 43</w:t>
+              <w:t xml:space="preserve">I.P.S.S.M. Art. 10 – 43</w:t>
             </w:r>
           </w:p>
         </w:tc>
@@ -6163,7 +5595,7 @@
                 <w:szCs w:val="20"/>
                 <w:lang w:val="ro-RO"/>
               </w:rPr>
-              <w:t>IPSSM Art. 44 – 45</w:t>
+              <w:t xml:space="preserve">I.P.S.S.M. Art. 44 – 45</w:t>
             </w:r>
           </w:p>
         </w:tc>
@@ -6349,7 +5781,7 @@
                 <w:szCs w:val="20"/>
                 <w:lang w:val="ro-RO"/>
               </w:rPr>
-              <w:t>IPSSM Art. 46 – 55</w:t>
+              <w:t xml:space="preserve">I.P.S.S.M. Art. 46 – 55</w:t>
             </w:r>
           </w:p>
         </w:tc>
@@ -6535,7 +5967,7 @@
                 <w:szCs w:val="20"/>
                 <w:lang w:val="ro-RO"/>
               </w:rPr>
-              <w:t>IPSSM Art. 56 – 62</w:t>
+              <w:t xml:space="preserve">I.P.S.S.M. Art. 56 – 62</w:t>
             </w:r>
           </w:p>
         </w:tc>
@@ -6721,7 +6153,7 @@
                 <w:szCs w:val="20"/>
                 <w:lang w:val="ro-RO"/>
               </w:rPr>
-              <w:t>IPSSM Art. 63 – 100</w:t>
+              <w:t xml:space="preserve">I.P.S.S.M. Art. 63 – 100</w:t>
             </w:r>
           </w:p>
         </w:tc>
@@ -6907,7 +6339,7 @@
                 <w:szCs w:val="20"/>
                 <w:lang w:val="ro-RO"/>
               </w:rPr>
-              <w:t>IPSSM Art. 101 – 171</w:t>
+              <w:t xml:space="preserve">I.P.S.S.M. Art. 101 – 171</w:t>
             </w:r>
           </w:p>
         </w:tc>
@@ -7234,7 +6666,7 @@
                 <w:szCs w:val="20"/>
                 <w:lang w:val="ro-RO"/>
               </w:rPr>
-              <w:t>IPSSM Art. 172 – 191</w:t>
+              <w:t xml:space="preserve">I.P.S.S.M. Art. 172 – 191</w:t>
             </w:r>
           </w:p>
         </w:tc>
@@ -7279,7 +6711,7 @@
                 <w:szCs w:val="20"/>
                 <w:lang w:val="ro-RO"/>
               </w:rPr>
-              <w:t>Instrucțiuni proprii în domeniul securității și sănătății în muncă privind stingerea incendiilor, utilizarea mijloacelor de stingerea incendiilor, alarmare, intervenție, evacuarea lucrătorilor stingerea incendiilor și evacuarea lucrătorilor la nivelul locurilor de muncă și/ sau posturilor de lucru</w:t>
+              <w:t xml:space="preserve">Instrucțiuni proprii în domeniul securității și sănătății în muncă privind stingerea incendiilor, utilizarea mijloacelor de stingerea incendiilor, alarmare, intervenție, evacuarea lucrătorilor la nivelul locurilor de muncă și/ sau posturilor de lucru</w:t>
             </w:r>
           </w:p>
         </w:tc>
@@ -7420,7 +6852,7 @@
                 <w:szCs w:val="20"/>
                 <w:lang w:val="ro-RO"/>
               </w:rPr>
-              <w:t>IPSSM Art. 192 – 209</w:t>
+              <w:t xml:space="preserve">I.P.S.S.M. Art. 192 – 209</w:t>
             </w:r>
           </w:p>
         </w:tc>
@@ -7465,7 +6897,7 @@
                 <w:szCs w:val="20"/>
                 <w:lang w:val="ro-RO"/>
               </w:rPr>
-              <w:t>Instrucțiuni proprii în domeniul securității și sănătății în muncă privind acordare materialelor igienico-sanitare și a alimentației de protecție, măsuri privind condițiilor de mediu necesitate și a restricțiilor care se impun pentru repartizarea personalului la locul de muncă, dimensionarea sarcinii de muncă și repartizarea acesteia</w:t>
+              <w:t xml:space="preserve">Instrucțiuni proprii în domeniul securității și sănătății în muncă privind acordarea materialelor igienico-sanitare și a alimentației de protecție, măsuri privind condițiile de mediu necesare și restricțiile care se impun pentru repartizarea personalului la locul de muncă, dimensionarea sarcinii de muncă și repartizarea acesteia</w:t>
             </w:r>
           </w:p>
         </w:tc>
@@ -7606,7 +7038,7 @@
                 <w:szCs w:val="20"/>
                 <w:lang w:val="ro-RO"/>
               </w:rPr>
-              <w:t>IPSSM Art. 210 – 240</w:t>
+              <w:t xml:space="preserve">I.P.S.S.M. Art. 210 – 240</w:t>
             </w:r>
           </w:p>
         </w:tc>
@@ -7792,7 +7224,7 @@
                 <w:szCs w:val="20"/>
                 <w:lang w:val="ro-RO"/>
               </w:rPr>
-              <w:t>IPSSM Art. 241 – 260</w:t>
+              <w:t xml:space="preserve">I.P.S.S.M. Art. 241 – 260</w:t>
             </w:r>
           </w:p>
         </w:tc>
@@ -7978,7 +7410,7 @@
                 <w:szCs w:val="20"/>
                 <w:lang w:val="ro-RO"/>
               </w:rPr>
-              <w:t>IPSSM Art. 261 – 294</w:t>
+              <w:t xml:space="preserve">I.P.S.S.M. Art. 261 – 294</w:t>
             </w:r>
           </w:p>
         </w:tc>
@@ -9328,15 +8760,16 @@
     <w:p>
       <w:pPr>
         <w:pStyle w:val="Normal"/>
-        <w:keepNext w:val="true"/>
+        <w:keepNext/>
+        <w:keepLines/>
         <w:widowControl/>
         <w:spacing w:before="240" w:after="120"/>
-        <w:ind w:hanging="0"/>
+        <w:ind w:left="0" w:hanging="0"/>
         <w:jc w:val="left"/>
         <w:rPr>
           <w:rFonts w:ascii="Arial" w:hAnsi="Arial" w:cs="Arial"/>
-          <w:sz w:val="10"/>
-          <w:szCs w:val="10"/>
+          <w:sz w:val="20"/>
+          <w:szCs w:val="20"/>
           <w:lang w:val="ro-RO"/>
         </w:rPr>
       </w:pPr>
@@ -9345,6 +8778,60 @@
           <w:rFonts w:eastAsia="Arial" w:cs="Arial" w:ascii="Arial" w:hAnsi="Arial"/>
           <w:b/>
           <w:color w:val="auto"/>
+          <w:sz w:val="20"/>
+          <w:szCs w:val="20"/>
+          <w:lang w:val="ro-RO"/>
+        </w:rPr>
+        <w:t xml:space="preserve">{{name}}</w:t>
+      </w:r>
+      <w:r>
+        <w:br/>
+      </w:r>
+      <w:r>
+        <w:rPr>
+          <w:rFonts w:eastAsia="Arial" w:cs="Arial" w:ascii="Arial" w:hAnsi="Arial"/>
+          <w:b/>
+          <w:color w:val="auto"/>
+          <w:sz w:val="20"/>
+          <w:szCs w:val="20"/>
+          <w:lang w:val="ro-RO"/>
+        </w:rPr>
+        <w:t xml:space="preserve">LOCUL DE MUNCĂ: </w:t>
+      </w:r>
+      <w:r>
+        <w:rPr>
+          <w:rFonts w:eastAsia="Arial" w:cs="Arial" w:ascii="Arial" w:hAnsi="Arial"/>
+          <w:b w:val="false"/>
+          <w:i w:val="false"/>
+          <w:color w:val="auto"/>
+          <w:spacing w:val="0"/>
+          <w:w w:val="100"/>
+          <w:sz w:val="20"/>
+          <w:szCs w:val="20"/>
+          <w:lang w:val="ro-RO"/>
+        </w:rPr>
+        <w:t>{{client.legalName}}</w:t>
+      </w:r>
+      <w:r>
+        <w:br/>
+      </w:r>
+      <w:r>
+        <w:rPr>
+          <w:rFonts w:eastAsia="Arial" w:cs="Arial" w:ascii="Arial" w:hAnsi="Arial"/>
+          <w:b/>
+          <w:color w:val="auto"/>
+          <w:sz w:val="20"/>
+          <w:szCs w:val="20"/>
+          <w:lang w:val="ro-RO"/>
+        </w:rPr>
+        <w:t xml:space="preserve">FUNCȚIA: </w:t>
+      </w:r>
+      <w:r>
+        <w:rPr>
+          <w:rFonts w:eastAsia="Arial" w:cs="Arial" w:ascii="Arial" w:hAnsi="Arial"/>
+          <w:b w:val="false"/>
+          <w:i w:val="false"/>
+          <w:color w:val="auto"/>
           <w:spacing w:val="0"/>
           <w:w w:val="100"/>
           <w:sz w:val="20"/>
@@ -9352,6 +8839,62 @@
           <w:lang w:val="ro-RO"/>
         </w:rPr>
         <w:t>{{name}}</w:t>
+      </w:r>
+      <w:r>
+        <w:br/>
+      </w:r>
+      <w:r>
+        <w:rPr>
+          <w:rFonts w:eastAsia="Arial" w:cs="Arial" w:ascii="Arial" w:hAnsi="Arial"/>
+          <w:b/>
+          <w:color w:val="auto"/>
+          <w:sz w:val="20"/>
+          <w:szCs w:val="20"/>
+          <w:lang w:val="ro-RO"/>
+        </w:rPr>
+        <w:t xml:space="preserve">CINE EFECTUEAZĂ INSTRUIREA – ȘEF DIRECT DE LOC DE MUNCĂ: </w:t>
+      </w:r>
+      <w:r>
+        <w:rPr>
+          <w:rFonts w:eastAsia="Arial" w:cs="Arial" w:ascii="Arial" w:hAnsi="Arial"/>
+          <w:b w:val="false"/>
+          <w:i w:val="false"/>
+          <w:color w:val="auto"/>
+          <w:spacing w:val="0"/>
+          <w:w w:val="100"/>
+          <w:sz w:val="20"/>
+          <w:szCs w:val="20"/>
+          <w:lang w:val="ro-RO"/>
+        </w:rPr>
+        <w:t>{{trainer}}</w:t>
+      </w:r>
+      <w:r>
+        <w:br/>
+      </w:r>
+      <w:r>
+        <w:rPr>
+          <w:rFonts w:eastAsia="Arial" w:cs="Arial" w:ascii="Arial" w:hAnsi="Arial"/>
+          <w:b/>
+          <w:color w:val="auto"/>
+          <w:sz w:val="20"/>
+          <w:szCs w:val="20"/>
+          <w:lang w:val="ro-RO"/>
+        </w:rPr>
+        <w:t xml:space="preserve">PERIODICITATE: </w:t>
+      </w:r>
+      <w:r>
+        <w:rPr>
+          <w:rFonts w:eastAsia="Arial" w:cs="Arial" w:ascii="Arial" w:hAnsi="Arial"/>
+          <w:b w:val="false"/>
+          <w:i w:val="false"/>
+          <w:color w:val="auto"/>
+          <w:spacing w:val="0"/>
+          <w:w w:val="100"/>
+          <w:sz w:val="20"/>
+          <w:szCs w:val="20"/>
+          <w:lang w:val="ro-RO"/>
+        </w:rPr>
+        <w:t>{{intervalLabel}}</w:t>
       </w:r>
     </w:p>
     <w:tbl>
@@ -9369,18 +8912,17 @@
       </w:tblPr>
       <w:tblGrid>
         <w:gridCol w:w="1700"/>
-        <w:gridCol w:w="1417"/>
-        <w:gridCol w:w="4537"/>
+        <w:gridCol w:w="5954"/>
         <w:gridCol w:w="1701"/>
       </w:tblGrid>
       <w:tr>
         <w:trPr>
           <w:cantSplit/>
+          <w:tblHeader/>
         </w:trPr>
         <w:tc>
           <w:tcPr>
-            <w:tcW w:w="3117" w:type="dxa"/>
-            <w:gridSpan w:val="2"/>
+            <w:tcW w:w="1700" w:type="dxa"/>
             <w:tcBorders>
               <w:top w:val="single" w:sz="4" w:space="0" w:color="000000"/>
               <w:left w:val="single" w:sz="4" w:space="0" w:color="000000"/>
@@ -9390,12 +8932,12 @@
           </w:tcPr>
           <w:p>
             <w:pPr>
-              <w:pStyle w:val="TableHeading"/>
+              <w:pStyle w:val="TableContents"/>
               <w:keepNext w:val="true"/>
               <w:widowControl/>
               <w:spacing w:before="0" w:after="0"/>
               <w:ind w:hanging="0" w:left="0"/>
-              <w:jc w:val="left"/>
+              <w:jc w:val="center"/>
               <w:rPr>
                 <w:rFonts w:ascii="Arial" w:hAnsi="Arial" w:eastAsia="Arial" w:cs="Arial"/>
                 <w:b/>
@@ -9420,55 +8962,100 @@
                 <w:szCs w:val="20"/>
                 <w:lang w:val="ro-RO"/>
               </w:rPr>
-              <w:t>LOCUL DE MUNCĂ:</w:t>
-            </w:r>
-          </w:p>
-        </w:tc>
-        <w:tc>
-          <w:tcPr>
-            <w:tcW w:w="6238" w:type="dxa"/>
-            <w:gridSpan w:val="2"/>
+              <w:t>Lunile anului</w:t>
+            </w:r>
+          </w:p>
+        </w:tc>
+        <w:tc>
+          <w:tcPr>
+            <w:tcW w:w="5954" w:type="dxa"/>
             <w:tcBorders>
               <w:top w:val="single" w:sz="4" w:space="0" w:color="000000"/>
               <w:left w:val="single" w:sz="4" w:space="0" w:color="000000"/>
               <w:bottom w:val="single" w:sz="4" w:space="0" w:color="000000"/>
+            </w:tcBorders>
+            <w:vAlign w:val="center"/>
+          </w:tcPr>
+          <w:p>
+            <w:pPr>
+              <w:pStyle w:val="TableContents"/>
+              <w:keepNext w:val="false"/>
+              <w:widowControl/>
+              <w:spacing w:before="0" w:after="0"/>
+              <w:ind w:hanging="0" w:left="0"/>
+              <w:jc w:val="center"/>
+              <w:rPr>
+                <w:rFonts w:ascii="Arial" w:hAnsi="Arial" w:eastAsia="Arial" w:cs="Arial"/>
+                <w:b/>
+                <w:i w:val="false"/>
+                <w:color w:val="auto"/>
+                <w:spacing w:val="0"/>
+                <w:w w:val="100"/>
+                <w:sz w:val="20"/>
+                <w:szCs w:val="20"/>
+                <w:lang w:val="ro-RO"/>
+              </w:rPr>
+            </w:pPr>
+            <w:r>
+              <w:rPr>
+                <w:rFonts w:eastAsia="Arial" w:cs="Arial" w:ascii="Arial" w:hAnsi="Arial"/>
+                <w:b/>
+                <w:i w:val="false"/>
+                <w:color w:val="auto"/>
+                <w:spacing w:val="0"/>
+                <w:w w:val="100"/>
+                <w:sz w:val="20"/>
+                <w:szCs w:val="20"/>
+                <w:lang w:val="ro-RO"/>
+              </w:rPr>
+              <w:t>Conținutul materialului de instruire</w:t>
+            </w:r>
+          </w:p>
+        </w:tc>
+        <w:tc>
+          <w:tcPr>
+            <w:tcW w:w="1701" w:type="dxa"/>
+            <w:tcBorders>
+              <w:top w:val="single" w:sz="4" w:space="0" w:color="000000"/>
+              <w:left w:val="single" w:sz="4" w:space="0" w:color="000000"/>
+              <w:bottom w:val="single" w:sz="4" w:space="0" w:color="000000"/>
               <w:right w:val="single" w:sz="4" w:space="0" w:color="000000"/>
             </w:tcBorders>
             <w:vAlign w:val="center"/>
           </w:tcPr>
           <w:p>
             <w:pPr>
-              <w:pStyle w:val="TableHeading"/>
-              <w:keepNext w:val="false"/>
-              <w:widowControl/>
-              <w:spacing w:before="0" w:after="0"/>
-              <w:ind w:hanging="0" w:left="0"/>
-              <w:jc w:val="left"/>
-              <w:rPr>
-                <w:rFonts w:ascii="Arial" w:hAnsi="Arial" w:eastAsia="Arial" w:cs="Arial"/>
-                <w:b w:val="false"/>
-                <w:i w:val="false"/>
-                <w:color w:val="auto"/>
-                <w:spacing w:val="0"/>
-                <w:w w:val="100"/>
-                <w:sz w:val="20"/>
-                <w:szCs w:val="20"/>
-                <w:lang w:val="ro-RO"/>
-              </w:rPr>
-            </w:pPr>
-            <w:r>
-              <w:rPr>
-                <w:rFonts w:eastAsia="Arial" w:cs="Arial" w:ascii="Arial" w:hAnsi="Arial"/>
-                <w:b w:val="false"/>
-                <w:i w:val="false"/>
-                <w:color w:val="auto"/>
-                <w:spacing w:val="0"/>
-                <w:w w:val="100"/>
-                <w:sz w:val="20"/>
-                <w:szCs w:val="20"/>
-                <w:lang w:val="ro-RO"/>
-              </w:rPr>
-              <w:t>{{client.legalName}}</w:t>
+              <w:pStyle w:val="TableContents"/>
+              <w:keepNext w:val="false"/>
+              <w:widowControl/>
+              <w:spacing w:before="0" w:after="0"/>
+              <w:ind w:hanging="0" w:left="0"/>
+              <w:jc w:val="center"/>
+              <w:rPr>
+                <w:rFonts w:ascii="Arial" w:hAnsi="Arial" w:eastAsia="Arial" w:cs="Arial"/>
+                <w:b/>
+                <w:i w:val="false"/>
+                <w:color w:val="auto"/>
+                <w:spacing w:val="0"/>
+                <w:w w:val="100"/>
+                <w:sz w:val="20"/>
+                <w:szCs w:val="20"/>
+                <w:lang w:val="ro-RO"/>
+              </w:rPr>
+            </w:pPr>
+            <w:r>
+              <w:rPr>
+                <w:rFonts w:eastAsia="Arial" w:cs="Arial" w:ascii="Arial" w:hAnsi="Arial"/>
+                <w:b/>
+                <w:i w:val="false"/>
+                <w:color w:val="auto"/>
+                <w:spacing w:val="0"/>
+                <w:w w:val="100"/>
+                <w:sz w:val="20"/>
+                <w:szCs w:val="20"/>
+                <w:lang w:val="ro-RO"/>
+              </w:rPr>
+              <w:t>Planul de desfășurare</w:t>
             </w:r>
           </w:p>
         </w:tc>
@@ -9479,300 +9066,6 @@
         </w:trPr>
         <w:tc>
           <w:tcPr>
-            <w:tcW w:w="3117" w:type="dxa"/>
-            <w:gridSpan w:val="2"/>
-            <w:tcBorders>
-              <w:left w:val="single" w:sz="4" w:space="0" w:color="000000"/>
-              <w:bottom w:val="single" w:sz="4" w:space="0" w:color="000000"/>
-            </w:tcBorders>
-            <w:vAlign w:val="center"/>
-          </w:tcPr>
-          <w:p>
-            <w:pPr>
-              <w:pStyle w:val="TableContents"/>
-              <w:keepNext w:val="true"/>
-              <w:widowControl/>
-              <w:spacing w:before="0" w:after="0"/>
-              <w:ind w:hanging="0" w:left="0"/>
-              <w:jc w:val="left"/>
-              <w:rPr>
-                <w:rFonts w:ascii="Arial" w:hAnsi="Arial" w:eastAsia="Arial" w:cs="Arial"/>
-                <w:b/>
-                <w:i w:val="false"/>
-                <w:color w:val="auto"/>
-                <w:spacing w:val="0"/>
-                <w:w w:val="100"/>
-                <w:sz w:val="20"/>
-                <w:szCs w:val="20"/>
-                <w:lang w:val="ro-RO"/>
-              </w:rPr>
-            </w:pPr>
-            <w:r>
-              <w:rPr>
-                <w:rFonts w:eastAsia="Arial" w:cs="Arial" w:ascii="Arial" w:hAnsi="Arial"/>
-                <w:b/>
-                <w:i w:val="false"/>
-                <w:color w:val="auto"/>
-                <w:spacing w:val="0"/>
-                <w:w w:val="100"/>
-                <w:sz w:val="20"/>
-                <w:szCs w:val="20"/>
-                <w:lang w:val="ro-RO"/>
-              </w:rPr>
-              <w:t>FUNCȚIA:</w:t>
-            </w:r>
-          </w:p>
-        </w:tc>
-        <w:tc>
-          <w:tcPr>
-            <w:tcW w:w="6238" w:type="dxa"/>
-            <w:gridSpan w:val="2"/>
-            <w:tcBorders>
-              <w:left w:val="single" w:sz="4" w:space="0" w:color="000000"/>
-              <w:bottom w:val="single" w:sz="4" w:space="0" w:color="000000"/>
-              <w:right w:val="single" w:sz="4" w:space="0" w:color="000000"/>
-            </w:tcBorders>
-            <w:vAlign w:val="center"/>
-          </w:tcPr>
-          <w:p>
-            <w:pPr>
-              <w:pStyle w:val="TableContents"/>
-              <w:keepNext w:val="false"/>
-              <w:widowControl/>
-              <w:spacing w:before="0" w:after="0"/>
-              <w:ind w:hanging="0" w:left="0"/>
-              <w:jc w:val="left"/>
-              <w:rPr>
-                <w:rFonts w:ascii="Arial" w:hAnsi="Arial" w:eastAsia="Arial" w:cs="Arial"/>
-                <w:b w:val="false"/>
-                <w:i w:val="false"/>
-                <w:color w:val="auto"/>
-                <w:spacing w:val="0"/>
-                <w:w w:val="100"/>
-                <w:sz w:val="20"/>
-                <w:szCs w:val="20"/>
-                <w:lang w:val="ro-RO"/>
-              </w:rPr>
-            </w:pPr>
-            <w:r>
-              <w:rPr>
-                <w:rFonts w:eastAsia="Arial" w:cs="Arial" w:ascii="Arial" w:hAnsi="Arial"/>
-                <w:b w:val="false"/>
-                <w:i w:val="false"/>
-                <w:color w:val="auto"/>
-                <w:spacing w:val="0"/>
-                <w:w w:val="100"/>
-                <w:sz w:val="20"/>
-                <w:szCs w:val="20"/>
-                <w:lang w:val="ro-RO"/>
-              </w:rPr>
-              <w:t>{{name}}</w:t>
-            </w:r>
-          </w:p>
-        </w:tc>
-      </w:tr>
-      <w:tr>
-        <w:trPr>
-          <w:cantSplit/>
-        </w:trPr>
-        <w:tc>
-          <w:tcPr>
-            <w:tcW w:w="3117" w:type="dxa"/>
-            <w:gridSpan w:val="2"/>
-            <w:tcBorders>
-              <w:left w:val="single" w:sz="4" w:space="0" w:color="000000"/>
-              <w:bottom w:val="single" w:sz="4" w:space="0" w:color="000000"/>
-            </w:tcBorders>
-            <w:vAlign w:val="center"/>
-          </w:tcPr>
-          <w:p>
-            <w:pPr>
-              <w:pStyle w:val="TableContents"/>
-              <w:keepNext w:val="true"/>
-              <w:widowControl/>
-              <w:spacing w:before="0" w:after="0"/>
-              <w:ind w:hanging="0" w:left="0"/>
-              <w:jc w:val="left"/>
-              <w:rPr>
-                <w:rFonts w:ascii="Arial" w:hAnsi="Arial" w:eastAsia="Arial" w:cs="Arial"/>
-                <w:b/>
-                <w:i w:val="false"/>
-                <w:color w:val="auto"/>
-                <w:spacing w:val="0"/>
-                <w:w w:val="100"/>
-                <w:sz w:val="20"/>
-                <w:szCs w:val="20"/>
-                <w:lang w:val="ro-RO"/>
-              </w:rPr>
-            </w:pPr>
-            <w:r>
-              <w:rPr>
-                <w:rFonts w:eastAsia="Arial" w:cs="Arial" w:ascii="Arial" w:hAnsi="Arial"/>
-                <w:b/>
-                <w:i w:val="false"/>
-                <w:color w:val="auto"/>
-                <w:spacing w:val="0"/>
-                <w:w w:val="100"/>
-                <w:sz w:val="20"/>
-                <w:szCs w:val="20"/>
-                <w:lang w:val="ro-RO"/>
-              </w:rPr>
-              <w:t>CINE EFECTUEAZĂ INSTRUIREA – ȘEF DIRECT DE LOC DE MUNCĂ:</w:t>
-            </w:r>
-          </w:p>
-        </w:tc>
-        <w:tc>
-          <w:tcPr>
-            <w:tcW w:w="6238" w:type="dxa"/>
-            <w:gridSpan w:val="2"/>
-            <w:tcBorders>
-              <w:left w:val="single" w:sz="4" w:space="0" w:color="000000"/>
-              <w:bottom w:val="single" w:sz="4" w:space="0" w:color="000000"/>
-              <w:right w:val="single" w:sz="4" w:space="0" w:color="000000"/>
-            </w:tcBorders>
-            <w:vAlign w:val="center"/>
-          </w:tcPr>
-          <w:p>
-            <w:pPr>
-              <w:pStyle w:val="TableContents"/>
-              <w:keepNext w:val="false"/>
-              <w:widowControl/>
-              <w:spacing w:before="0" w:after="0"/>
-              <w:ind w:hanging="0" w:left="0"/>
-              <w:jc w:val="left"/>
-              <w:rPr>
-                <w:rFonts w:ascii="Arial" w:hAnsi="Arial" w:eastAsia="Arial" w:cs="Arial"/>
-                <w:b w:val="false"/>
-                <w:i w:val="false"/>
-                <w:color w:val="auto"/>
-                <w:spacing w:val="0"/>
-                <w:w w:val="100"/>
-                <w:sz w:val="20"/>
-                <w:szCs w:val="20"/>
-                <w:lang w:val="ro-RO"/>
-              </w:rPr>
-            </w:pPr>
-            <w:r>
-              <w:rPr>
-                <w:rFonts w:eastAsia="Arial" w:cs="Arial" w:ascii="Arial" w:hAnsi="Arial"/>
-                <w:b w:val="false"/>
-                <w:i w:val="false"/>
-                <w:color w:val="auto"/>
-                <w:spacing w:val="0"/>
-                <w:w w:val="100"/>
-                <w:sz w:val="20"/>
-                <w:szCs w:val="20"/>
-                <w:lang w:val="ro-RO"/>
-              </w:rPr>
-              <w:t>{{trainer}}</w:t>
-            </w:r>
-          </w:p>
-        </w:tc>
-      </w:tr>
-      <w:tr>
-        <w:trPr>
-          <w:cantSplit/>
-        </w:trPr>
-        <w:tc>
-          <w:tcPr>
-            <w:tcW w:w="3117" w:type="dxa"/>
-            <w:gridSpan w:val="2"/>
-            <w:tcBorders>
-              <w:left w:val="single" w:sz="4" w:space="0" w:color="000000"/>
-              <w:bottom w:val="single" w:sz="4" w:space="0" w:color="000000"/>
-            </w:tcBorders>
-            <w:vAlign w:val="center"/>
-          </w:tcPr>
-          <w:p>
-            <w:pPr>
-              <w:pStyle w:val="TableContents"/>
-              <w:keepNext w:val="true"/>
-              <w:widowControl/>
-              <w:spacing w:before="0" w:after="0"/>
-              <w:ind w:hanging="0" w:left="0"/>
-              <w:jc w:val="left"/>
-              <w:rPr>
-                <w:rFonts w:ascii="Arial" w:hAnsi="Arial" w:eastAsia="Arial" w:cs="Arial"/>
-                <w:b/>
-                <w:i w:val="false"/>
-                <w:color w:val="auto"/>
-                <w:spacing w:val="0"/>
-                <w:w w:val="100"/>
-                <w:sz w:val="20"/>
-                <w:szCs w:val="20"/>
-                <w:lang w:val="ro-RO"/>
-              </w:rPr>
-            </w:pPr>
-            <w:r>
-              <w:rPr>
-                <w:rFonts w:eastAsia="Arial" w:cs="Arial" w:ascii="Arial" w:hAnsi="Arial"/>
-                <w:b/>
-                <w:i w:val="false"/>
-                <w:color w:val="auto"/>
-                <w:spacing w:val="0"/>
-                <w:w w:val="100"/>
-                <w:sz w:val="20"/>
-                <w:szCs w:val="20"/>
-                <w:lang w:val="ro-RO"/>
-              </w:rPr>
-              <w:t>PERIODICITATE:</w:t>
-            </w:r>
-          </w:p>
-        </w:tc>
-        <w:tc>
-          <w:tcPr>
-            <w:tcW w:w="6238" w:type="dxa"/>
-            <w:gridSpan w:val="2"/>
-            <w:tcBorders>
-              <w:left w:val="single" w:sz="4" w:space="0" w:color="000000"/>
-              <w:bottom w:val="single" w:sz="4" w:space="0" w:color="000000"/>
-              <w:right w:val="single" w:sz="4" w:space="0" w:color="000000"/>
-            </w:tcBorders>
-            <w:vAlign w:val="center"/>
-          </w:tcPr>
-          <w:p>
-            <w:pPr>
-              <w:pStyle w:val="TableContents"/>
-              <w:keepNext w:val="false"/>
-              <w:widowControl/>
-              <w:spacing w:before="0" w:after="0"/>
-              <w:ind w:hanging="0" w:left="0"/>
-              <w:jc w:val="left"/>
-              <w:rPr>
-                <w:rFonts w:ascii="Arial" w:hAnsi="Arial" w:eastAsia="Arial" w:cs="Arial"/>
-                <w:b w:val="false"/>
-                <w:i w:val="false"/>
-                <w:color w:val="auto"/>
-                <w:spacing w:val="0"/>
-                <w:w w:val="100"/>
-                <w:sz w:val="20"/>
-                <w:szCs w:val="20"/>
-                <w:lang w:val="ro-RO"/>
-              </w:rPr>
-            </w:pPr>
-            <w:r>
-              <w:rPr>
-                <w:rFonts w:eastAsia="Arial" w:cs="Arial" w:ascii="Arial" w:hAnsi="Arial"/>
-                <w:b w:val="false"/>
-                <w:i w:val="false"/>
-                <w:color w:val="auto"/>
-                <w:spacing w:val="0"/>
-                <w:w w:val="100"/>
-                <w:sz w:val="20"/>
-                <w:szCs w:val="20"/>
-                <w:lang w:val="ro-RO"/>
-              </w:rPr>
-              <w:t>{{intervalLabel}}</w:t>
-            </w:r>
-          </w:p>
-        </w:tc>
-      </w:tr>
-      <w:tr>
-        <w:trPr>
-          <w:cantSplit/>
-        </w:trPr>
-        <w:tc>
-          <w:tcPr>
             <w:tcW w:w="1700" w:type="dxa"/>
             <w:tcBorders>
               <w:left w:val="single" w:sz="4" w:space="0" w:color="000000"/>
@@ -9783,185 +9076,42 @@
           <w:p>
             <w:pPr>
               <w:pStyle w:val="TableContents"/>
-              <w:keepNext w:val="true"/>
+              <w:keepNext w:val="false"/>
               <w:widowControl/>
               <w:spacing w:before="0" w:after="0"/>
               <w:ind w:hanging="0" w:left="0"/>
               <w:jc w:val="center"/>
               <w:rPr>
                 <w:rFonts w:ascii="Arial" w:hAnsi="Arial" w:eastAsia="Arial" w:cs="Arial"/>
-                <w:b/>
-                <w:i w:val="false"/>
-                <w:color w:val="auto"/>
-                <w:spacing w:val="0"/>
-                <w:w w:val="100"/>
-                <w:sz w:val="20"/>
-                <w:szCs w:val="20"/>
-                <w:lang w:val="ro-RO"/>
-              </w:rPr>
-            </w:pPr>
-            <w:r>
-              <w:rPr>
-                <w:rFonts w:eastAsia="Arial" w:cs="Arial" w:ascii="Arial" w:hAnsi="Arial"/>
-                <w:b/>
-                <w:i w:val="false"/>
-                <w:color w:val="auto"/>
-                <w:spacing w:val="0"/>
-                <w:w w:val="100"/>
-                <w:sz w:val="20"/>
-                <w:szCs w:val="20"/>
-                <w:lang w:val="ro-RO"/>
-              </w:rPr>
-              <w:t>Lunile anului</w:t>
+                <w:b w:val="false"/>
+                <w:i w:val="false"/>
+                <w:color w:val="auto"/>
+                <w:spacing w:val="0"/>
+                <w:w w:val="100"/>
+                <w:sz w:val="20"/>
+                <w:szCs w:val="20"/>
+                <w:lang w:val="ro-RO"/>
+              </w:rPr>
+            </w:pPr>
+            <w:r>
+              <w:rPr>
+                <w:rFonts w:eastAsia="Arial" w:cs="Arial" w:ascii="Arial" w:hAnsi="Arial"/>
+                <w:b w:val="false"/>
+                <w:i w:val="false"/>
+                <w:color w:val="auto"/>
+                <w:spacing w:val="0"/>
+                <w:w w:val="100"/>
+                <w:sz w:val="20"/>
+                <w:szCs w:val="20"/>
+                <w:lang w:val="ro-RO"/>
+              </w:rPr>
+              <w:t>{{#sessions}}{{month}}</w:t>
             </w:r>
           </w:p>
         </w:tc>
         <w:tc>
           <w:tcPr>
             <w:tcW w:w="5954" w:type="dxa"/>
-            <w:gridSpan w:val="2"/>
-            <w:tcBorders>
-              <w:left w:val="single" w:sz="4" w:space="0" w:color="000000"/>
-              <w:bottom w:val="single" w:sz="4" w:space="0" w:color="000000"/>
-            </w:tcBorders>
-            <w:vAlign w:val="center"/>
-          </w:tcPr>
-          <w:p>
-            <w:pPr>
-              <w:pStyle w:val="TableContents"/>
-              <w:keepNext w:val="false"/>
-              <w:widowControl/>
-              <w:spacing w:before="0" w:after="0"/>
-              <w:ind w:hanging="0" w:left="0"/>
-              <w:jc w:val="center"/>
-              <w:rPr>
-                <w:rFonts w:ascii="Arial" w:hAnsi="Arial" w:eastAsia="Arial" w:cs="Arial"/>
-                <w:b/>
-                <w:i w:val="false"/>
-                <w:color w:val="auto"/>
-                <w:spacing w:val="0"/>
-                <w:w w:val="100"/>
-                <w:sz w:val="20"/>
-                <w:szCs w:val="20"/>
-                <w:lang w:val="ro-RO"/>
-              </w:rPr>
-            </w:pPr>
-            <w:r>
-              <w:rPr>
-                <w:rFonts w:eastAsia="Arial" w:cs="Arial" w:ascii="Arial" w:hAnsi="Arial"/>
-                <w:b/>
-                <w:i w:val="false"/>
-                <w:color w:val="auto"/>
-                <w:spacing w:val="0"/>
-                <w:w w:val="100"/>
-                <w:sz w:val="20"/>
-                <w:szCs w:val="20"/>
-                <w:lang w:val="ro-RO"/>
-              </w:rPr>
-              <w:t>Conținutul materialului de instruire</w:t>
-            </w:r>
-          </w:p>
-        </w:tc>
-        <w:tc>
-          <w:tcPr>
-            <w:tcW w:w="1701" w:type="dxa"/>
-            <w:tcBorders>
-              <w:left w:val="single" w:sz="4" w:space="0" w:color="000000"/>
-              <w:bottom w:val="single" w:sz="4" w:space="0" w:color="000000"/>
-              <w:right w:val="single" w:sz="4" w:space="0" w:color="000000"/>
-            </w:tcBorders>
-            <w:vAlign w:val="center"/>
-          </w:tcPr>
-          <w:p>
-            <w:pPr>
-              <w:pStyle w:val="TableContents"/>
-              <w:keepNext w:val="false"/>
-              <w:widowControl/>
-              <w:spacing w:before="0" w:after="0"/>
-              <w:ind w:hanging="0" w:left="0"/>
-              <w:jc w:val="center"/>
-              <w:rPr>
-                <w:rFonts w:ascii="Arial" w:hAnsi="Arial" w:eastAsia="Arial" w:cs="Arial"/>
-                <w:b/>
-                <w:i w:val="false"/>
-                <w:color w:val="auto"/>
-                <w:spacing w:val="0"/>
-                <w:w w:val="100"/>
-                <w:sz w:val="20"/>
-                <w:szCs w:val="20"/>
-                <w:lang w:val="ro-RO"/>
-              </w:rPr>
-            </w:pPr>
-            <w:r>
-              <w:rPr>
-                <w:rFonts w:eastAsia="Arial" w:cs="Arial" w:ascii="Arial" w:hAnsi="Arial"/>
-                <w:b/>
-                <w:i w:val="false"/>
-                <w:color w:val="auto"/>
-                <w:spacing w:val="0"/>
-                <w:w w:val="100"/>
-                <w:sz w:val="20"/>
-                <w:szCs w:val="20"/>
-                <w:lang w:val="ro-RO"/>
-              </w:rPr>
-              <w:t>Planul de desfășurare</w:t>
-            </w:r>
-          </w:p>
-        </w:tc>
-      </w:tr>
-      <w:tr>
-        <w:trPr>
-          <w:cantSplit/>
-        </w:trPr>
-        <w:tc>
-          <w:tcPr>
-            <w:tcW w:w="1700" w:type="dxa"/>
-            <w:tcBorders>
-              <w:left w:val="single" w:sz="4" w:space="0" w:color="000000"/>
-              <w:bottom w:val="single" w:sz="4" w:space="0" w:color="000000"/>
-            </w:tcBorders>
-            <w:vAlign w:val="center"/>
-          </w:tcPr>
-          <w:p>
-            <w:pPr>
-              <w:pStyle w:val="TableContents"/>
-              <w:keepNext w:val="false"/>
-              <w:widowControl/>
-              <w:spacing w:before="0" w:after="0"/>
-              <w:ind w:hanging="0" w:left="0"/>
-              <w:jc w:val="center"/>
-              <w:rPr>
-                <w:rFonts w:ascii="Arial" w:hAnsi="Arial" w:eastAsia="Arial" w:cs="Arial"/>
-                <w:b w:val="false"/>
-                <w:i w:val="false"/>
-                <w:color w:val="auto"/>
-                <w:spacing w:val="0"/>
-                <w:w w:val="100"/>
-                <w:sz w:val="20"/>
-                <w:szCs w:val="20"/>
-                <w:lang w:val="ro-RO"/>
-              </w:rPr>
-            </w:pPr>
-            <w:r>
-              <w:rPr>
-                <w:rFonts w:eastAsia="Arial" w:cs="Arial" w:ascii="Arial" w:hAnsi="Arial"/>
-                <w:b w:val="false"/>
-                <w:i w:val="false"/>
-                <w:color w:val="auto"/>
-                <w:spacing w:val="0"/>
-                <w:w w:val="100"/>
-                <w:sz w:val="20"/>
-                <w:szCs w:val="20"/>
-                <w:lang w:val="ro-RO"/>
-              </w:rPr>
-              <w:t>{{#sessions}}{{month}}</w:t>
-            </w:r>
-          </w:p>
-        </w:tc>
-        <w:tc>
-          <w:tcPr>
-            <w:tcW w:w="5954" w:type="dxa"/>
-            <w:gridSpan w:val="2"/>
             <w:tcBorders>
               <w:left w:val="single" w:sz="4" w:space="0" w:color="000000"/>
               <w:bottom w:val="single" w:sz="4" w:space="0" w:color="000000"/>

</xml_diff>

<commit_message>
fix(templates): 4.2 labels the trainer without calling it the direct manager
"CINE EFECTUEAZĂ INSTRUIREA – ȘEF DIRECT DE LOC DE MUNCĂ:" headed the provider too, who
trains the technical-administrative posts. Chapters II and III now read "CINE EFECTUEAZĂ
INSTRUIREA:", as chapter I does.

Claude-Session: https://claude.ai/code/session_01A9qjCHVH6kcDAEKFiJoShR
</commit_message>
<xml_diff>
--- a/packages/document-engine/templates/4.2_training_themes.docx
+++ b/packages/document-engine/templates/4.2_training_themes.docx
@@ -4380,7 +4380,7 @@
           <w:szCs w:val="20"/>
           <w:lang w:val="ro-RO"/>
         </w:rPr>
-        <w:t>{{client.legalName}}</w:t>
+        <w:t xml:space="preserve">{{client.legalName}}</w:t>
       </w:r>
       <w:r>
         <w:br/>
@@ -4408,7 +4408,7 @@
           <w:szCs w:val="20"/>
           <w:lang w:val="ro-RO"/>
         </w:rPr>
-        <w:t>{{name}}</w:t>
+        <w:t xml:space="preserve">{{name}}</w:t>
       </w:r>
       <w:r>
         <w:br/>
@@ -4422,7 +4422,7 @@
           <w:szCs w:val="20"/>
           <w:lang w:val="ro-RO"/>
         </w:rPr>
-        <w:t xml:space="preserve">CINE EFECTUEAZĂ INSTRUIREA – ȘEF DIRECT DE LOC DE MUNCĂ: </w:t>
+        <w:t xml:space="preserve">CINE EFECTUEAZĂ INSTRUIREA: </w:t>
       </w:r>
       <w:r>
         <w:rPr>
@@ -4436,7 +4436,7 @@
           <w:szCs w:val="20"/>
           <w:lang w:val="ro-RO"/>
         </w:rPr>
-        <w:t>{{trainer}}</w:t>
+        <w:t xml:space="preserve">{{trainer}}</w:t>
       </w:r>
       <w:r>
         <w:br/>
@@ -8810,7 +8810,7 @@
           <w:szCs w:val="20"/>
           <w:lang w:val="ro-RO"/>
         </w:rPr>
-        <w:t>{{client.legalName}}</w:t>
+        <w:t xml:space="preserve">{{client.legalName}}</w:t>
       </w:r>
       <w:r>
         <w:br/>
@@ -8838,7 +8838,7 @@
           <w:szCs w:val="20"/>
           <w:lang w:val="ro-RO"/>
         </w:rPr>
-        <w:t>{{name}}</w:t>
+        <w:t xml:space="preserve">{{name}}</w:t>
       </w:r>
       <w:r>
         <w:br/>
@@ -8852,7 +8852,7 @@
           <w:szCs w:val="20"/>
           <w:lang w:val="ro-RO"/>
         </w:rPr>
-        <w:t xml:space="preserve">CINE EFECTUEAZĂ INSTRUIREA – ȘEF DIRECT DE LOC DE MUNCĂ: </w:t>
+        <w:t xml:space="preserve">CINE EFECTUEAZĂ INSTRUIREA: </w:t>
       </w:r>
       <w:r>
         <w:rPr>
@@ -8866,7 +8866,7 @@
           <w:szCs w:val="20"/>
           <w:lang w:val="ro-RO"/>
         </w:rPr>
-        <w:t>{{trainer}}</w:t>
+        <w:t xml:space="preserve">{{trainer}}</w:t>
       </w:r>
       <w:r>
         <w:br/>
@@ -8894,7 +8894,7 @@
           <w:szCs w:val="20"/>
           <w:lang w:val="ro-RO"/>
         </w:rPr>
-        <w:t>{{intervalLabel}}</w:t>
+        <w:t xml:space="preserve">{{intervalLabel}}</w:t>
       </w:r>
     </w:p>
     <w:tbl>

</xml_diff>

<commit_message>
fix(templates): the own instructions lose Art. 81–86, a word-for-word repeat of Art. 75–80
The common part now runs from 1 to 288 and chapters VII to XII start six
articles earlier (95, 166, 186, 204, 235, 255). The 4.2 template's plan rows
and "I.P.S.S.M. Art. 1 – 288", themes.ts' chapter starts and count, the
tests, the preview data and ADRs 012 and 014 follow. theme-chapters.test.ts
now also holds the ranges 4.2 prints to the chapters counted in 3.2 and 2.2.

Claude-Session: https://claude.ai/code/session_01A9qjCHVH6kcDAEKFiJoShR
</commit_message>
<xml_diff>
--- a/packages/document-engine/templates/4.2_training_themes.docx
+++ b/packages/document-engine/templates/4.2_training_themes.docx
@@ -4464,7 +4464,7 @@
           <w:szCs w:val="20"/>
           <w:lang w:val="ro-RO"/>
         </w:rPr>
-        <w:t xml:space="preserve">H.G. 1051/2006, H.G. 1146/2006, H.G. 493/2006; H.G. 259/2022; I.P.S.S.M. Art. 1 – 294; {{#modules}}{{citation}}; {{/modules}}Demonstrații practice privind activitățile desfășurate, echipamentele de muncă utilizate, utilizarea echipamentului individual de protecție, a mijloacelor de alarmare, intervenție, evacuare și de prim ajutor.</w:t>
+        <w:t xml:space="preserve">H.G. 1051/2006, H.G. 1146/2006, H.G. 493/2006; H.G. 259/2022; I.P.S.S.M. Art. 1 – 288; {{#modules}}{{citation}}; {{/modules}}Demonstrații practice privind activitățile desfășurate, echipamentele de muncă utilizate, utilizarea echipamentului individual de protecție, a mijloacelor de alarmare, intervenție, evacuare și de prim ajutor.</w:t>
       </w:r>
     </w:p>
     <w:p>
@@ -6153,7 +6153,7 @@
                 <w:szCs w:val="20"/>
                 <w:lang w:val="ro-RO"/>
               </w:rPr>
-              <w:t xml:space="preserve">I.P.S.S.M. Art. 63 – 100</w:t>
+              <w:t xml:space="preserve">I.P.S.S.M. Art. 63 – 94</w:t>
             </w:r>
           </w:p>
         </w:tc>
@@ -6339,7 +6339,7 @@
                 <w:szCs w:val="20"/>
                 <w:lang w:val="ro-RO"/>
               </w:rPr>
-              <w:t xml:space="preserve">I.P.S.S.M. Art. 101 – 171</w:t>
+              <w:t xml:space="preserve">I.P.S.S.M. Art. 95 – 165</w:t>
             </w:r>
           </w:p>
         </w:tc>
@@ -6666,7 +6666,7 @@
                 <w:szCs w:val="20"/>
                 <w:lang w:val="ro-RO"/>
               </w:rPr>
-              <w:t xml:space="preserve">I.P.S.S.M. Art. 172 – 191</w:t>
+              <w:t xml:space="preserve">I.P.S.S.M. Art. 166 – 185</w:t>
             </w:r>
           </w:p>
         </w:tc>
@@ -6852,7 +6852,7 @@
                 <w:szCs w:val="20"/>
                 <w:lang w:val="ro-RO"/>
               </w:rPr>
-              <w:t xml:space="preserve">I.P.S.S.M. Art. 192 – 209</w:t>
+              <w:t xml:space="preserve">I.P.S.S.M. Art. 186 – 203</w:t>
             </w:r>
           </w:p>
         </w:tc>
@@ -7038,7 +7038,7 @@
                 <w:szCs w:val="20"/>
                 <w:lang w:val="ro-RO"/>
               </w:rPr>
-              <w:t xml:space="preserve">I.P.S.S.M. Art. 210 – 240</w:t>
+              <w:t xml:space="preserve">I.P.S.S.M. Art. 204 – 234</w:t>
             </w:r>
           </w:p>
         </w:tc>
@@ -7224,7 +7224,7 @@
                 <w:szCs w:val="20"/>
                 <w:lang w:val="ro-RO"/>
               </w:rPr>
-              <w:t xml:space="preserve">I.P.S.S.M. Art. 241 – 260</w:t>
+              <w:t xml:space="preserve">I.P.S.S.M. Art. 235 – 254</w:t>
             </w:r>
           </w:p>
         </w:tc>
@@ -7410,7 +7410,7 @@
                 <w:szCs w:val="20"/>
                 <w:lang w:val="ro-RO"/>
               </w:rPr>
-              <w:t xml:space="preserve">I.P.S.S.M. Art. 261 – 294</w:t>
+              <w:t xml:space="preserve">I.P.S.S.M. Art. 255 – 288</w:t>
             </w:r>
           </w:p>
         </w:tc>

</xml_diff>

<commit_message>
fix(templates): the own instructions lose Art. 193, a word-for-word repeat of Art. 192
Art. 192 and 193 both took over O.U.G. 99/2000 Art. 7 with the same two
items. The common part now runs from 1 to 287 and chapters X to XII start one
article earlier (203, 234, 254). The 4.2 template's plan rows and
"I.P.S.S.M. Art. 1 – 287", themes.ts' chapter starts and count, the tests, the
preview data and ADRs 012 and 014 follow.

Claude-Session: https://claude.ai/code/session_01A9qjCHVH6kcDAEKFiJoShR
</commit_message>
<xml_diff>
--- a/packages/document-engine/templates/4.2_training_themes.docx
+++ b/packages/document-engine/templates/4.2_training_themes.docx
@@ -4464,7 +4464,7 @@
           <w:szCs w:val="20"/>
           <w:lang w:val="ro-RO"/>
         </w:rPr>
-        <w:t xml:space="preserve">H.G. 1051/2006, H.G. 1146/2006, H.G. 493/2006; H.G. 259/2022; I.P.S.S.M. Art. 1 – 288; {{#modules}}{{citation}}; {{/modules}}Demonstrații practice privind activitățile desfășurate, echipamentele de muncă utilizate, utilizarea echipamentului individual de protecție, a mijloacelor de alarmare, intervenție, evacuare și de prim ajutor.</w:t>
+        <w:t xml:space="preserve">H.G. 1051/2006, H.G. 1146/2006, H.G. 493/2006; H.G. 259/2022; I.P.S.S.M. Art. 1 – 287; {{#modules}}{{citation}}; {{/modules}}Demonstrații practice privind activitățile desfășurate, echipamentele de muncă utilizate, utilizarea echipamentului individual de protecție, a mijloacelor de alarmare, intervenție, evacuare și de prim ajutor.</w:t>
       </w:r>
     </w:p>
     <w:p>
@@ -6852,7 +6852,7 @@
                 <w:szCs w:val="20"/>
                 <w:lang w:val="ro-RO"/>
               </w:rPr>
-              <w:t xml:space="preserve">I.P.S.S.M. Art. 186 – 203</w:t>
+              <w:t xml:space="preserve">I.P.S.S.M. Art. 186 – 202</w:t>
             </w:r>
           </w:p>
         </w:tc>
@@ -7038,7 +7038,7 @@
                 <w:szCs w:val="20"/>
                 <w:lang w:val="ro-RO"/>
               </w:rPr>
-              <w:t xml:space="preserve">I.P.S.S.M. Art. 204 – 234</w:t>
+              <w:t xml:space="preserve">I.P.S.S.M. Art. 203 – 233</w:t>
             </w:r>
           </w:p>
         </w:tc>
@@ -7224,7 +7224,7 @@
                 <w:szCs w:val="20"/>
                 <w:lang w:val="ro-RO"/>
               </w:rPr>
-              <w:t xml:space="preserve">I.P.S.S.M. Art. 235 – 254</w:t>
+              <w:t xml:space="preserve">I.P.S.S.M. Art. 234 – 253</w:t>
             </w:r>
           </w:p>
         </w:tc>
@@ -7410,7 +7410,7 @@
                 <w:szCs w:val="20"/>
                 <w:lang w:val="ro-RO"/>
               </w:rPr>
-              <w:t xml:space="preserve">I.P.S.S.M. Art. 255 – 288</w:t>
+              <w:t xml:space="preserve">I.P.S.S.M. Art. 254 – 287</w:t>
             </w:r>
           </w:p>
         </w:tc>

</xml_diff>

<commit_message>
fix(templates): the training themes' hyphen, list separator and three plan titles
"INTRODUCTIV-GENERALĂ" in the chapter I headings; the chapter II citations separate the
four H.G.s with commas; plan II.II rows 5, 8 and 12 read "(atât în interiorul unității,
cât și …)", "mijloacelor de stingere a incendiilor" and "acordarea, utilizarea și alte
informații", as 3.2's chapter titles do once corrected.

Claude-Session: https://claude.ai/code/session_01A9qjCHVH6kcDAEKFiJoShR
</commit_message>
<xml_diff>
--- a/packages/document-engine/templates/4.2_training_themes.docx
+++ b/packages/document-engine/templates/4.2_training_themes.docx
@@ -42,7 +42,7 @@
           <w:szCs w:val="20"/>
           <w:lang w:val="ro-RO" w:eastAsia="ro-RO"/>
         </w:rPr>
-        <w:t>TEMATICA DE INSTRUIRE PENTRU INSTRUIREA INTRODUCTIV – GENERALĂ</w:t>
+        <w:t xml:space="preserve">TEMATICA DE INSTRUIRE PENTRU INSTRUIREA INTRODUCTIV-GENERALĂ</w:t>
       </w:r>
     </w:p>
     <w:p>
@@ -211,7 +211,7 @@
           <w:szCs w:val="20"/>
           <w:lang w:val="ro-RO" w:eastAsia="ro-RO"/>
         </w:rPr>
-        <w:t>PLANUL DE DESFĂȘURARE PENTRU INSTRUIREA INTRODUCTIV – GENERALĂ / 4 ORE</w:t>
+        <w:t xml:space="preserve">PLANUL DE DESFĂȘURARE PENTRU INSTRUIREA INTRODUCTIV-GENERALĂ / 4 ORE</w:t>
       </w:r>
     </w:p>
     <w:tbl>
@@ -4464,7 +4464,7 @@
           <w:szCs w:val="20"/>
           <w:lang w:val="ro-RO"/>
         </w:rPr>
-        <w:t xml:space="preserve">H.G. 1051/2006, H.G. 1146/2006, H.G. 493/2006; H.G. 259/2022; I.P.S.S.M. Art. 1 – 287; {{#modules}}{{citation}}; {{/modules}}Demonstrații practice privind activitățile desfășurate, echipamentele de muncă utilizate, utilizarea echipamentului individual de protecție, a mijloacelor de alarmare, intervenție, evacuare și de prim ajutor.</w:t>
+        <w:t xml:space="preserve">H.G. 1051/2006, H.G. 1146/2006, H.G. 493/2006, H.G. 259/2022; I.P.S.S.M. Art. 1 – 287; {{#modules}}{{citation}}; {{/modules}}Demonstrații practice privind activitățile desfășurate, echipamentele de muncă utilizate, utilizarea echipamentului individual de protecție, a mijloacelor de alarmare, intervenție, evacuare și de prim ajutor.</w:t>
       </w:r>
     </w:p>
     <w:p>
@@ -6012,7 +6012,7 @@
                 <w:szCs w:val="20"/>
                 <w:lang w:val="ro-RO"/>
               </w:rPr>
-              <w:t>Instrucțiuni proprii în domeniul securității și sănătății în muncă privind circulația pietonilor și circulația bicicliștilor (atât în interiorul unității cât și în exteriorul unității)</w:t>
+              <w:t xml:space="preserve">Instrucțiuni proprii în domeniul securității și sănătății în muncă privind circulația pietonilor și circulația bicicliștilor (atât în interiorul unității, cât și în exteriorul unității)</w:t>
             </w:r>
           </w:p>
         </w:tc>
@@ -6711,7 +6711,7 @@
                 <w:szCs w:val="20"/>
                 <w:lang w:val="ro-RO"/>
               </w:rPr>
-              <w:t xml:space="preserve">Instrucțiuni proprii în domeniul securității și sănătății în muncă privind stingerea incendiilor, utilizarea mijloacelor de stingerea incendiilor, alarmare, intervenție, evacuarea lucrătorilor la nivelul locurilor de muncă și/ sau posturilor de lucru</w:t>
+              <w:t xml:space="preserve">Instrucțiuni proprii în domeniul securității și sănătății în muncă privind stingerea incendiilor, utilizarea mijloacelor de stingere a incendiilor, alarmare, intervenție, evacuarea lucrătorilor la nivelul locurilor de muncă și/ sau posturilor de lucru</w:t>
             </w:r>
           </w:p>
         </w:tc>
@@ -7455,7 +7455,7 @@
                 <w:szCs w:val="20"/>
                 <w:lang w:val="ro-RO"/>
               </w:rPr>
-              <w:t>Măsuri la nivelul locurilor de muncă și/ sau posturilor de lucru privind acordarea, utilizarea, și alte informații utile referitor la echipamentele individuale de protecție</w:t>
+              <w:t xml:space="preserve">Măsuri la nivelul locurilor de muncă și/ sau posturilor de lucru privind acordarea, utilizarea și alte informații utile referitor la echipamentele individuale de protecție</w:t>
             </w:r>
           </w:p>
         </w:tc>

</xml_diff>

<commit_message>
fix(templates): the general training material drops the repealed parts of Legea 346/2002
Art. 184 quoted Legea 346 art. 6 (optional individual insurance) and Art. 212–214 its old contributions chapter ("art. 106, 110, 111"); O.U.G. 103/2017 repealed art. 6 and the whole chapter VIII (art. 80–90 of the 2014 republication) from 1 January 2018, with no successor. The four articles go, the act list reads "Art. 1 – 5, 7, 14, 18, 22 – 24, 26, 29 – 49", and Art. 181 c) quotes the current art. 3 lit. c) (contributions borne by employers under the Fiscal Code).

2.2 now runs to Art. 323 and its chapters from XI on start four articles earlier: 4.2's rows (153 – 211 … 297 – 322, Art. 323) and its "Conform MISSMIG Art. 1 – 323", the chapter starts in themes.ts, the training themes test and ADR 014 follow.

Claude-Session: https://claude.ai/code/session_01A9qjCHVH6kcDAEKFiJoShR
</commit_message>
<xml_diff>
--- a/packages/document-engine/templates/4.2_training_themes.docx
+++ b/packages/document-engine/templates/4.2_training_themes.docx
@@ -168,7 +168,7 @@
           <w:szCs w:val="20"/>
           <w:lang w:val="ro-RO"/>
         </w:rPr>
-        <w:t>Conform MISSMIG Art. 1 – 327; Legislația de securitate și sănătate în muncă; Consecințele posibile ale necunoașterii și nerespectării legislației de securitate și sănătate în muncă; Măsuri de acordare a primului ajutor, de prevenire și stingere a incendiilor și evacuarea lucrătorilor; Riscurile de accidentare și îmbolnăvire profesională specifice unității.</w:t>
+        <w:t xml:space="preserve">Conform MISSMIG Art. 1 – 323; Legislația de securitate și sănătate în muncă; Consecințele posibile ale necunoașterii și nerespectării legislației de securitate și sănătate în muncă; Măsuri de acordare a primului ajutor, de prevenire și stingere a incendiilor și evacuarea lucrătorilor; Riscurile de accidentare și îmbolnăvire profesională specifice unității.</w:t>
       </w:r>
     </w:p>
     <w:p>
@@ -2143,7 +2143,7 @@
                 <w:szCs w:val="20"/>
                 <w:lang w:val="ro-RO"/>
               </w:rPr>
-              <w:t>MISSMIG Art. 153 – 215</w:t>
+              <w:t xml:space="preserve">MISSMIG Art. 153 – 211</w:t>
             </w:r>
           </w:p>
         </w:tc>
@@ -2470,7 +2470,7 @@
                 <w:szCs w:val="20"/>
                 <w:lang w:val="ro-RO"/>
               </w:rPr>
-              <w:t>MISSMIG Art. 216 – 238</w:t>
+              <w:t xml:space="preserve">MISSMIG Art. 212 – 234</w:t>
             </w:r>
           </w:p>
         </w:tc>
@@ -2656,7 +2656,7 @@
                 <w:szCs w:val="20"/>
                 <w:lang w:val="ro-RO"/>
               </w:rPr>
-              <w:t>MISSMIG Art. 239 – 270</w:t>
+              <w:t xml:space="preserve">MISSMIG Art. 235 – 266</w:t>
             </w:r>
           </w:p>
         </w:tc>
@@ -2842,7 +2842,7 @@
                 <w:szCs w:val="20"/>
                 <w:lang w:val="ro-RO"/>
               </w:rPr>
-              <w:t>MISSMIG Art. 271 – 278</w:t>
+              <w:t xml:space="preserve">MISSMIG Art. 267 – 274</w:t>
             </w:r>
           </w:p>
         </w:tc>
@@ -3028,7 +3028,7 @@
                 <w:szCs w:val="20"/>
                 <w:lang w:val="ro-RO"/>
               </w:rPr>
-              <w:t>MISSMIG Art. 279 – 291</w:t>
+              <w:t xml:space="preserve">MISSMIG Art. 275 – 287</w:t>
             </w:r>
           </w:p>
         </w:tc>
@@ -3214,7 +3214,7 @@
                 <w:szCs w:val="20"/>
                 <w:lang w:val="ro-RO"/>
               </w:rPr>
-              <w:t>MISSMIG Art. 292 – 300</w:t>
+              <w:t xml:space="preserve">MISSMIG Art. 288 – 296</w:t>
             </w:r>
           </w:p>
         </w:tc>
@@ -3400,7 +3400,7 @@
                 <w:szCs w:val="20"/>
                 <w:lang w:val="ro-RO"/>
               </w:rPr>
-              <w:t>MISSMIG Art. 301 – 326</w:t>
+              <w:t xml:space="preserve">MISSMIG Art. 297 – 322</w:t>
             </w:r>
           </w:p>
         </w:tc>
@@ -3586,7 +3586,7 @@
                 <w:szCs w:val="20"/>
                 <w:lang w:val="ro-RO"/>
               </w:rPr>
-              <w:t>MISSMIG Art. 327</w:t>
+              <w:t xml:space="preserve">MISSMIG Art. 323</w:t>
             </w:r>
           </w:p>
         </w:tc>

</xml_diff>

<commit_message>
fix(documents): 4.2 writes the act numbers as "1051/ 2006"
The ten act numbers of chapter II (H.G. 1051, 1028, 1146, 493/2006 and
259/2022, in the content line and in row I) take the space after the slash
that 1.1 and 11 use.

Claude-Session: https://claude.ai/code/session_01A9qjCHVH6kcDAEKFiJoShR
</commit_message>
<xml_diff>
--- a/packages/document-engine/templates/4.2_training_themes.docx
+++ b/packages/document-engine/templates/4.2_training_themes.docx
@@ -4464,7 +4464,7 @@
           <w:szCs w:val="20"/>
           <w:lang w:val="ro-RO"/>
         </w:rPr>
-        <w:t xml:space="preserve">H.G. 1051/2006, H.G. 1028/2006, H.G. 1146/2006, H.G. 493/2006, H.G. 259/2022; I.P.S.S.M. Art. 1 – 287; {{#modules}}{{citation}}; {{/modules}}Demonstrații practice privind activitățile desfășurate, echipamentele de muncă utilizate, utilizarea echipamentului individual de protecție, a mijloacelor de alarmare, intervenție, evacuare și de prim ajutor.</w:t>
+        <w:t xml:space="preserve">H.G. 1051/ 2006, H.G. 1028/ 2006, H.G. 1146/ 2006, H.G. 493/ 2006, H.G. 259/ 2022; I.P.S.S.M. Art. 1 – 287; {{#modules}}{{citation}}; {{/modules}}Demonstrații practice privind activitățile desfășurate, echipamentele de muncă utilizate, utilizarea echipamentului individual de protecție, a mijloacelor de alarmare, intervenție, evacuare și de prim ajutor.</w:t>
       </w:r>
     </w:p>
     <w:p>
@@ -4940,7 +4940,7 @@
                 <w:szCs w:val="20"/>
                 <w:lang w:val="ro-RO"/>
               </w:rPr>
-              <w:t xml:space="preserve">H.G. 1051/2006, H.G. 1028/2006, H.G. 1146/2006, H.G. 493/2006, H.G. 259/2022</w:t>
+              <w:t xml:space="preserve">H.G. 1051/ 2006, H.G. 1028/ 2006, H.G. 1146/ 2006, H.G. 493/ 2006, H.G. 259/ 2022</w:t>
             </w:r>
           </w:p>
         </w:tc>

</xml_diff>

<commit_message>
fix(templates): the vulnerable-groups chapter quotes O.U.G. 96/2003 and H.G. 600/2007 as in force
3.2 chapter X: the maternity articles are the text of O.U.G. 96/2003 after Legea 154/2015,
each attributed, with the allowance from O.U.G. 158/2005 art. 31 and annex 2; the young
workers' articles are H.G. 600/2007 art. 3–15 instead of an adaptation of Directive 94/33;
the chapter opens with Legea 319/2006 art. 35–36. 2.2 chapter XI gains the ban on insalubrious
work (art. 20) and the allowance article, and loses the comma in "art. N, alin.".

3.2 runs to 297 articles and 2.2 to 322; the chapter starts in themes.ts, the typed ranges of
4.2 and the tests follow.

Refs #280

Claude-Session: https://claude.ai/code/session_011H3SB7vPMevXGQUkjGaBx5
</commit_message>
<xml_diff>
--- a/packages/document-engine/templates/4.2_training_themes.docx
+++ b/packages/document-engine/templates/4.2_training_themes.docx
@@ -168,7 +168,7 @@
           <w:szCs w:val="20"/>
           <w:lang w:val="ro-RO"/>
         </w:rPr>
-        <w:t xml:space="preserve">Conform MISSMIG Art. 1 – 320; Legislația de securitate și sănătate în muncă; Consecințele posibile ale necunoașterii și nerespectării legislației de securitate și sănătate în muncă; Măsuri de acordare a primului ajutor, de prevenire și stingere a incendiilor și evacuarea lucrătorilor; Riscurile de accidentare și îmbolnăvire profesională specifice unității.</w:t>
+        <w:t xml:space="preserve">Conform MISSMIG Art. 1 – 322; Legislația de securitate și sănătate în muncă; Consecințele posibile ale necunoașterii și nerespectării legislației de securitate și sănătate în muncă; Măsuri de acordare a primului ajutor, de prevenire și stingere a incendiilor și evacuarea lucrătorilor; Riscurile de accidentare și îmbolnăvire profesională specifice unității.</w:t>
       </w:r>
     </w:p>
     <w:p>
@@ -2470,7 +2470,7 @@
                 <w:szCs w:val="20"/>
                 <w:lang w:val="ro-RO"/>
               </w:rPr>
-              <w:t xml:space="preserve">MISSMIG Art. 210 – 232</w:t>
+              <w:t xml:space="preserve">MISSMIG Art. 210 – 234</w:t>
             </w:r>
           </w:p>
         </w:tc>
@@ -2656,7 +2656,7 @@
                 <w:szCs w:val="20"/>
                 <w:lang w:val="ro-RO"/>
               </w:rPr>
-              <w:t xml:space="preserve">MISSMIG Art. 233 – 264</w:t>
+              <w:t xml:space="preserve">MISSMIG Art. 235 – 266</w:t>
             </w:r>
           </w:p>
         </w:tc>
@@ -2842,7 +2842,7 @@
                 <w:szCs w:val="20"/>
                 <w:lang w:val="ro-RO"/>
               </w:rPr>
-              <w:t xml:space="preserve">MISSMIG Art. 265 – 272</w:t>
+              <w:t xml:space="preserve">MISSMIG Art. 267 – 274</w:t>
             </w:r>
           </w:p>
         </w:tc>
@@ -3028,7 +3028,7 @@
                 <w:szCs w:val="20"/>
                 <w:lang w:val="ro-RO"/>
               </w:rPr>
-              <w:t xml:space="preserve">MISSMIG Art. 273 – 285</w:t>
+              <w:t xml:space="preserve">MISSMIG Art. 275 – 287</w:t>
             </w:r>
           </w:p>
         </w:tc>
@@ -3214,7 +3214,7 @@
                 <w:szCs w:val="20"/>
                 <w:lang w:val="ro-RO"/>
               </w:rPr>
-              <w:t xml:space="preserve">MISSMIG Art. 286 – 294</w:t>
+              <w:t xml:space="preserve">MISSMIG Art. 288 – 296</w:t>
             </w:r>
           </w:p>
         </w:tc>
@@ -3400,7 +3400,7 @@
                 <w:szCs w:val="20"/>
                 <w:lang w:val="ro-RO"/>
               </w:rPr>
-              <w:t xml:space="preserve">MISSMIG Art. 295 – 319</w:t>
+              <w:t xml:space="preserve">MISSMIG Art. 297 – 321</w:t>
             </w:r>
           </w:p>
         </w:tc>
@@ -3586,7 +3586,7 @@
                 <w:szCs w:val="20"/>
                 <w:lang w:val="ro-RO"/>
               </w:rPr>
-              <w:t xml:space="preserve">MISSMIG Art. 320</w:t>
+              <w:t xml:space="preserve">MISSMIG Art. 322</w:t>
             </w:r>
           </w:p>
         </w:tc>
@@ -4464,7 +4464,7 @@
           <w:szCs w:val="20"/>
           <w:lang w:val="ro-RO"/>
         </w:rPr>
-        <w:t xml:space="preserve">H.G. 1051/ 2006, H.G. 1028/ 2006, H.G. 1146/ 2006, H.G. 493/ 2006, H.G. 259/ 2022; I.P.S.S.M. Art. 1 – 287; {{#modules}}{{citation}}; {{/modules}}Demonstrații practice privind activitățile desfășurate, echipamentele de muncă utilizate, utilizarea echipamentului individual de protecție, a mijloacelor de alarmare, intervenție, evacuare și de prim ajutor.</w:t>
+        <w:t xml:space="preserve">H.G. 1051/ 2006, H.G. 1028/ 2006, H.G. 1146/ 2006, H.G. 493/ 2006, H.G. 259/ 2022; I.P.S.S.M. Art. 1 – 297; {{#modules}}{{citation}}; {{/modules}}Demonstrații practice privind activitățile desfășurate, echipamentele de muncă utilizate, utilizarea echipamentului individual de protecție, a mijloacelor de alarmare, intervenție, evacuare și de prim ajutor.</w:t>
       </w:r>
     </w:p>
     <w:p>
@@ -7038,7 +7038,7 @@
                 <w:szCs w:val="20"/>
                 <w:lang w:val="ro-RO"/>
               </w:rPr>
-              <w:t xml:space="preserve">I.P.S.S.M. Art. 203 – 233</w:t>
+              <w:t xml:space="preserve">I.P.S.S.M. Art. 203 – 243</w:t>
             </w:r>
           </w:p>
         </w:tc>
@@ -7224,7 +7224,7 @@
                 <w:szCs w:val="20"/>
                 <w:lang w:val="ro-RO"/>
               </w:rPr>
-              <w:t xml:space="preserve">I.P.S.S.M. Art. 234 – 253</w:t>
+              <w:t xml:space="preserve">I.P.S.S.M. Art. 244 – 263</w:t>
             </w:r>
           </w:p>
         </w:tc>
@@ -7410,7 +7410,7 @@
                 <w:szCs w:val="20"/>
                 <w:lang w:val="ro-RO"/>
               </w:rPr>
-              <w:t xml:space="preserve">I.P.S.S.M. Art. 254 – 287</w:t>
+              <w:t xml:space="preserve">I.P.S.S.M. Art. 264 – 297</w:t>
             </w:r>
           </w:p>
         </w:tc>

</xml_diff>